<commit_message>
band-advance: Email-band Outlook draft button, notify links to the artist page, 3rd-party bookings get their own doc, case-safe filing (no Dropbox case conflicts), Additional Info row in the advance doc, deploy guard on main
Co-Authored-By: Claude Fable 5.1 <noreply@anthropic.com>
</commit_message>
<xml_diff>
--- a/Code/BandInfoForm/tools/doc_templates/3CDC Universal Show Advance.docx
+++ b/Code/BandInfoForm/tools/doc_templates/3CDC Universal Show Advance.docx
@@ -5087,6 +5087,122 @@
                       <w:szCs w:val="20"/>
                     </w:rPr>
                     <w:t xml:space="preserve"/>
+                  </w:r>
+                </w:p>
+              </w:tc>
+            </w:tr>
+            <w:tr>
+              <w:tc>
+                <w:tcPr>
+                  <w:tcW w:type="dxa" w:w="1750"/>
+                  <w:tcMar>
+                    <w:top w:type="dxa" w:w="40"/>
+                    <w:left w:type="dxa" w:w="80"/>
+                    <w:bottom w:type="dxa" w:w="40"/>
+                    <w:right w:type="dxa" w:w="80"/>
+                  </w:tcMar>
+                  <w:vAlign w:val="top"/>
+                </w:tcPr>
+                <w:p>
+                  <w:pPr>
+                    <w:spacing w:after="0"/>
+                    <w:jc w:val="right"/>
+                  </w:pPr>
+                  <w:r>
+                    <w:rPr>
+                      <w:rFonts w:ascii="Calibri" w:cs="Calibri" w:eastAsia="Times New Roman" w:hAnsi="Calibri"/>
+                      <w:b/>
+                      <w:bCs/>
+                      <w:i w:val="false"/>
+                      <w:iCs w:val="false"/>
+                      <w:sz w:val="20"/>
+                      <w:szCs w:val="20"/>
+                    </w:rPr>
+                    <w:t>Additional Info</w:t>
+                  </w:r>
+                </w:p>
+              </w:tc>
+              <w:tc>
+                <w:tcPr>
+                  <w:tcW w:type="dxa" w:w="1850"/>
+                  <w:tcMar>
+                    <w:top w:type="dxa" w:w="40"/>
+                    <w:left w:type="dxa" w:w="80"/>
+                    <w:bottom w:type="dxa" w:w="40"/>
+                    <w:right w:type="dxa" w:w="80"/>
+                  </w:tcMar>
+                  <w:vAlign w:val="top"/>
+                </w:tcPr>
+                <w:p>
+                  <w:pPr>
+                    <w:spacing w:after="0"/>
+                  </w:pPr>
+                  <w:r>
+                    <w:rPr>
+                      <w:rFonts w:ascii="Calibri" w:cs="Calibri" w:eastAsia="Times New Roman" w:hAnsi="Calibri"/>
+                      <w:b w:val="false"/>
+                      <w:bCs w:val="false"/>
+                      <w:i w:val="false"/>
+                      <w:iCs w:val="false"/>
+                      <w:sz w:val="20"/>
+                      <w:szCs w:val="20"/>
+                    </w:rPr>
+                  </w:r>
+                </w:p>
+              </w:tc>
+              <w:tc>
+                <w:tcPr>
+                  <w:tcW w:type="dxa" w:w="1850"/>
+                  <w:tcMar>
+                    <w:top w:type="dxa" w:w="40"/>
+                    <w:left w:type="dxa" w:w="80"/>
+                    <w:bottom w:type="dxa" w:w="40"/>
+                    <w:right w:type="dxa" w:w="80"/>
+                  </w:tcMar>
+                  <w:vAlign w:val="top"/>
+                </w:tcPr>
+                <w:p>
+                  <w:pPr>
+                    <w:spacing w:after="0"/>
+                  </w:pPr>
+                  <w:r>
+                    <w:rPr>
+                      <w:rFonts w:ascii="Calibri" w:cs="Calibri" w:eastAsia="Times New Roman" w:hAnsi="Calibri"/>
+                      <w:b w:val="false"/>
+                      <w:bCs w:val="false"/>
+                      <w:i w:val="false"/>
+                      <w:iCs w:val="false"/>
+                      <w:sz w:val="20"/>
+                      <w:szCs w:val="20"/>
+                    </w:rPr>
+                  </w:r>
+                </w:p>
+              </w:tc>
+              <w:tc>
+                <w:tcPr>
+                  <w:tcW w:type="dxa" w:w="1850"/>
+                  <w:tcMar>
+                    <w:top w:type="dxa" w:w="40"/>
+                    <w:left w:type="dxa" w:w="80"/>
+                    <w:bottom w:type="dxa" w:w="40"/>
+                    <w:right w:type="dxa" w:w="80"/>
+                  </w:tcMar>
+                  <w:vAlign w:val="top"/>
+                </w:tcPr>
+                <w:p>
+                  <w:pPr>
+                    <w:spacing w:after="0"/>
+                  </w:pPr>
+                  <w:r>
+                    <w:rPr>
+                      <w:rFonts w:ascii="Calibri" w:cs="Calibri" w:eastAsia="Times New Roman" w:hAnsi="Calibri"/>
+                      <w:b w:val="false"/>
+                      <w:bCs w:val="false"/>
+                      <w:i w:val="false"/>
+                      <w:iCs w:val="false"/>
+                      <w:sz w:val="20"/>
+                      <w:szCs w:val="20"/>
+                    </w:rPr>
                   </w:r>
                 </w:p>
               </w:tc>

</xml_diff>

<commit_message>
brand: branded band email wired, Prod Adv template restyle, light venue-themed form, tech pack generator + drafts
Staging in progress; not deployed.

Co-Authored-By: Claude Opus 5.5 <noreply@anthropic.com>
</commit_message>
<xml_diff>
--- a/Code/BandInfoForm/tools/doc_templates/3CDC Universal Show Advance.docx
+++ b/Code/BandInfoForm/tools/doc_templates/3CDC Universal Show Advance.docx
@@ -4,17 +4,17 @@
   <w:body>
     <w:p>
       <w:pPr>
-        <w:spacing w:after="40"/>
+        <w:spacing w:after="40" w:line="204" w:lineRule="auto"/>
         <w:jc w:val="center"/>
       </w:pPr>
       <w:r>
         <w:rPr>
-          <w:rFonts w:ascii="Calibri" w:cs="Calibri" w:eastAsia="Times New Roman" w:hAnsi="Calibri"/>
+          <w:rFonts w:ascii="Avenir Next" w:cs="Avenir Next" w:eastAsia="Avenir Next" w:hAnsi="Avenir Next"/>
           <w:b w:val="false"/>
           <w:bCs w:val="false"/>
           <w:i/>
           <w:iCs/>
-          <w:sz w:val="22"/>
+          <w:sz w:val="17"/>
           <w:szCs w:val="22"/>
         </w:rPr>
         <w:t xml:space="preserve">“The 3CDC Tech Team’s purpose is to provide professional event support that enriches the Cincinnati community while maintaining safe and respectful environments and prioritizing integrity, teamwork and quality.”</w:t>
@@ -22,17 +22,17 @@
     </w:p>
     <w:p>
       <w:pPr>
-        <w:spacing w:after="120"/>
+        <w:spacing w:after="120" w:line="204" w:lineRule="auto"/>
         <w:jc w:val="center"/>
       </w:pPr>
       <w:r>
         <w:rPr>
-          <w:rFonts w:ascii="Calibri" w:cs="Calibri" w:eastAsia="Times New Roman" w:hAnsi="Calibri"/>
+          <w:rFonts w:ascii="Avenir Next" w:cs="Avenir Next" w:eastAsia="Avenir Next" w:hAnsi="Avenir Next"/>
           <w:b w:val="false"/>
           <w:bCs w:val="false"/>
           <w:i/>
           <w:iCs/>
-          <w:sz w:val="22"/>
+          <w:sz w:val="17"/>
           <w:szCs w:val="22"/>
         </w:rPr>
         <w:t xml:space="preserve">3CDC Advance Contact - Brian</w:t>
@@ -42,12 +42,12 @@
       <w:tblPr>
         <w:tblW w:type="dxa" w:w="10800"/>
         <w:tblBorders>
-          <w:top w:val="single" w:color="000000" w:sz="4"/>
-          <w:left w:val="single" w:color="000000" w:sz="4"/>
-          <w:bottom w:val="single" w:color="000000" w:sz="4"/>
-          <w:right w:val="single" w:color="000000" w:sz="4"/>
-          <w:insideH w:val="single" w:color="auto" w:sz="4"/>
-          <w:insideV w:val="single" w:color="000000" w:sz="4"/>
+          <w:top w:val="single" w:color="9D9FA2" w:sz="4"/>
+          <w:left w:val="single" w:color="9D9FA2" w:sz="4"/>
+          <w:bottom w:val="single" w:color="9D9FA2" w:sz="4"/>
+          <w:right w:val="single" w:color="9D9FA2" w:sz="4"/>
+          <w:insideH w:val="single" w:color="9D9FA2" w:sz="4"/>
+          <w:insideV w:val="single" w:color="9D9FA2" w:sz="4"/>
         </w:tblBorders>
       </w:tblPr>
       <w:tblGrid>
@@ -68,11 +68,11 @@
           </w:tcPr>
           <w:p>
             <w:pPr>
-              <w:spacing w:after="60"/>
+              <w:spacing w:after="60" w:line="204" w:lineRule="auto"/>
             </w:pPr>
             <w:r>
               <w:rPr>
-                <w:rFonts w:ascii="Calibri" w:cs="Calibri" w:eastAsia="Times New Roman" w:hAnsi="Calibri"/>
+                <w:rFonts w:ascii="Avenir Next Condensed" w:cs="Avenir Next Condensed" w:eastAsia="Avenir Next Condensed" w:hAnsi="Avenir Next Condensed"/>
                 <w:b/>
                 <w:bCs/>
                 <w:i w:val="false"/>
@@ -87,12 +87,12 @@
             <w:tblPr>
               <w:tblW w:type="dxa" w:w="3400"/>
               <w:tblBorders>
-                <w:top w:val="single" w:color="000000" w:sz="4"/>
-                <w:left w:val="single" w:color="000000" w:sz="4"/>
-                <w:bottom w:val="single" w:color="000000" w:sz="4"/>
-                <w:right w:val="single" w:color="000000" w:sz="4"/>
-                <w:insideH w:val="single" w:color="000000" w:sz="4"/>
-                <w:insideV w:val="single" w:color="000000" w:sz="4"/>
+                <w:top w:val="single" w:color="9D9FA2" w:sz="4"/>
+                <w:left w:val="single" w:color="9D9FA2" w:sz="4"/>
+                <w:bottom w:val="single" w:color="9D9FA2" w:sz="4"/>
+                <w:right w:val="single" w:color="9D9FA2" w:sz="4"/>
+                <w:insideH w:val="single" w:color="9D9FA2" w:sz="4"/>
+                <w:insideV w:val="single" w:color="9D9FA2" w:sz="4"/>
               </w:tblBorders>
             </w:tblPr>
             <w:tblGrid>
@@ -113,11 +113,11 @@
                 </w:tcPr>
                 <w:p>
                   <w:pPr>
-                    <w:spacing w:after="40"/>
-                  </w:pPr>
-                  <w:r>
-                    <w:rPr>
-                      <w:rFonts w:ascii="Calibri" w:cs="Calibri" w:eastAsia="Times New Roman" w:hAnsi="Calibri"/>
+                    <w:spacing w:after="40" w:line="204" w:lineRule="auto"/>
+                  </w:pPr>
+                  <w:r>
+                    <w:rPr>
+                      <w:rFonts w:ascii="Avenir Next" w:cs="Avenir Next" w:eastAsia="Avenir Next" w:hAnsi="Avenir Next"/>
                       <w:b w:val="false"/>
                       <w:bCs w:val="false"/>
                       <w:i w:val="false"/>
@@ -141,11 +141,11 @@
                 </w:tcPr>
                 <w:p>
                   <w:pPr>
-                    <w:spacing w:after="40"/>
-                  </w:pPr>
-                  <w:r>
-                    <w:rPr>
-                      <w:rFonts w:ascii="Calibri" w:cs="Calibri" w:eastAsia="Times New Roman" w:hAnsi="Calibri"/>
+                    <w:spacing w:after="40" w:line="204" w:lineRule="auto"/>
+                  </w:pPr>
+                  <w:r>
+                    <w:rPr>
+                      <w:rFonts w:ascii="Avenir Next" w:cs="Avenir Next" w:eastAsia="Avenir Next" w:hAnsi="Avenir Next"/>
                       <w:b w:val="false"/>
                       <w:bCs w:val="false"/>
                       <w:i w:val="false"/>
@@ -172,11 +172,11 @@
                 </w:tcPr>
                 <w:p>
                   <w:pPr>
-                    <w:spacing w:after="40"/>
-                  </w:pPr>
-                  <w:r>
-                    <w:rPr>
-                      <w:rFonts w:ascii="Calibri" w:cs="Calibri" w:eastAsia="Times New Roman" w:hAnsi="Calibri"/>
+                    <w:spacing w:after="40" w:line="204" w:lineRule="auto"/>
+                  </w:pPr>
+                  <w:r>
+                    <w:rPr>
+                      <w:rFonts w:ascii="Avenir Next" w:cs="Avenir Next" w:eastAsia="Avenir Next" w:hAnsi="Avenir Next"/>
                       <w:b w:val="false"/>
                       <w:bCs w:val="false"/>
                       <w:i w:val="false"/>
@@ -200,11 +200,11 @@
                 </w:tcPr>
                 <w:p>
                   <w:pPr>
-                    <w:spacing w:after="40"/>
-                  </w:pPr>
-                  <w:r>
-                    <w:rPr>
-                      <w:rFonts w:ascii="Calibri" w:cs="Calibri" w:eastAsia="Times New Roman" w:hAnsi="Calibri"/>
+                    <w:spacing w:after="40" w:line="204" w:lineRule="auto"/>
+                  </w:pPr>
+                  <w:r>
+                    <w:rPr>
+                      <w:rFonts w:ascii="Avenir Next" w:cs="Avenir Next" w:eastAsia="Avenir Next" w:hAnsi="Avenir Next"/>
                       <w:b w:val="false"/>
                       <w:bCs w:val="false"/>
                       <w:i w:val="false"/>
@@ -231,11 +231,11 @@
                 </w:tcPr>
                 <w:p>
                   <w:pPr>
-                    <w:spacing w:after="40"/>
-                  </w:pPr>
-                  <w:r>
-                    <w:rPr>
-                      <w:rFonts w:ascii="Calibri" w:cs="Calibri" w:eastAsia="Times New Roman" w:hAnsi="Calibri"/>
+                    <w:spacing w:after="40" w:line="204" w:lineRule="auto"/>
+                  </w:pPr>
+                  <w:r>
+                    <w:rPr>
+                      <w:rFonts w:ascii="Avenir Next" w:cs="Avenir Next" w:eastAsia="Avenir Next" w:hAnsi="Avenir Next"/>
                       <w:b w:val="false"/>
                       <w:bCs w:val="false"/>
                       <w:i w:val="false"/>
@@ -259,11 +259,11 @@
                 </w:tcPr>
                 <w:p>
                   <w:pPr>
-                    <w:spacing w:after="40"/>
-                  </w:pPr>
-                  <w:r>
-                    <w:rPr>
-                      <w:rFonts w:ascii="Calibri" w:cs="Calibri" w:eastAsia="Times New Roman" w:hAnsi="Calibri"/>
+                    <w:spacing w:after="40" w:line="204" w:lineRule="auto"/>
+                  </w:pPr>
+                  <w:r>
+                    <w:rPr>
+                      <w:rFonts w:ascii="Avenir Next" w:cs="Avenir Next" w:eastAsia="Avenir Next" w:hAnsi="Avenir Next"/>
                       <w:b w:val="false"/>
                       <w:bCs w:val="false"/>
                       <w:i w:val="false"/>
@@ -290,11 +290,11 @@
                 </w:tcPr>
                 <w:p>
                   <w:pPr>
-                    <w:spacing w:after="40"/>
-                  </w:pPr>
-                  <w:r>
-                    <w:rPr>
-                      <w:rFonts w:ascii="Calibri" w:cs="Calibri" w:eastAsia="Times New Roman" w:hAnsi="Calibri"/>
+                    <w:spacing w:after="40" w:line="204" w:lineRule="auto"/>
+                  </w:pPr>
+                  <w:r>
+                    <w:rPr>
+                      <w:rFonts w:ascii="Avenir Next" w:cs="Avenir Next" w:eastAsia="Avenir Next" w:hAnsi="Avenir Next"/>
                       <w:b w:val="false"/>
                       <w:bCs w:val="false"/>
                       <w:i w:val="false"/>
@@ -318,11 +318,11 @@
                 </w:tcPr>
                 <w:p>
                   <w:pPr>
-                    <w:spacing w:after="40"/>
-                  </w:pPr>
-                  <w:r>
-                    <w:rPr>
-                      <w:rFonts w:ascii="Calibri" w:cs="Calibri" w:eastAsia="Times New Roman" w:hAnsi="Calibri"/>
+                    <w:spacing w:after="40" w:line="204" w:lineRule="auto"/>
+                  </w:pPr>
+                  <w:r>
+                    <w:rPr>
+                      <w:rFonts w:ascii="Avenir Next" w:cs="Avenir Next" w:eastAsia="Avenir Next" w:hAnsi="Avenir Next"/>
                       <w:b w:val="false"/>
                       <w:bCs w:val="false"/>
                       <w:i w:val="false"/>
@@ -349,11 +349,11 @@
                 </w:tcPr>
                 <w:p>
                   <w:pPr>
-                    <w:spacing w:after="40"/>
-                  </w:pPr>
-                  <w:r>
-                    <w:rPr>
-                      <w:rFonts w:ascii="Calibri" w:cs="Calibri" w:eastAsia="Times New Roman" w:hAnsi="Calibri"/>
+                    <w:spacing w:after="40" w:line="204" w:lineRule="auto"/>
+                  </w:pPr>
+                  <w:r>
+                    <w:rPr>
+                      <w:rFonts w:ascii="Avenir Next" w:cs="Avenir Next" w:eastAsia="Avenir Next" w:hAnsi="Avenir Next"/>
                       <w:b w:val="false"/>
                       <w:bCs w:val="false"/>
                       <w:i w:val="false"/>
@@ -377,11 +377,11 @@
                 </w:tcPr>
                 <w:p>
                   <w:pPr>
-                    <w:spacing w:after="40"/>
-                  </w:pPr>
-                  <w:r>
-                    <w:rPr>
-                      <w:rFonts w:ascii="Calibri" w:cs="Calibri" w:eastAsia="Times New Roman" w:hAnsi="Calibri"/>
+                    <w:spacing w:after="40" w:line="204" w:lineRule="auto"/>
+                  </w:pPr>
+                  <w:r>
+                    <w:rPr>
+                      <w:rFonts w:ascii="Avenir Next" w:cs="Avenir Next" w:eastAsia="Avenir Next" w:hAnsi="Avenir Next"/>
                       <w:b w:val="false"/>
                       <w:bCs w:val="false"/>
                       <w:i w:val="false"/>
@@ -408,11 +408,11 @@
                 </w:tcPr>
                 <w:p>
                   <w:pPr>
-                    <w:spacing w:after="40"/>
-                  </w:pPr>
-                  <w:r>
-                    <w:rPr>
-                      <w:rFonts w:ascii="Calibri" w:cs="Calibri" w:eastAsia="Times New Roman" w:hAnsi="Calibri"/>
+                    <w:spacing w:after="40" w:line="204" w:lineRule="auto"/>
+                  </w:pPr>
+                  <w:r>
+                    <w:rPr>
+                      <w:rFonts w:ascii="Avenir Next" w:cs="Avenir Next" w:eastAsia="Avenir Next" w:hAnsi="Avenir Next"/>
                       <w:b w:val="false"/>
                       <w:bCs w:val="false"/>
                       <w:i w:val="false"/>
@@ -436,11 +436,11 @@
                 </w:tcPr>
                 <w:p>
                   <w:pPr>
-                    <w:spacing w:after="40"/>
-                  </w:pPr>
-                  <w:r>
-                    <w:rPr>
-                      <w:rFonts w:ascii="Calibri" w:cs="Calibri" w:eastAsia="Times New Roman" w:hAnsi="Calibri"/>
+                    <w:spacing w:after="40" w:line="204" w:lineRule="auto"/>
+                  </w:pPr>
+                  <w:r>
+                    <w:rPr>
+                      <w:rFonts w:ascii="Avenir Next" w:cs="Avenir Next" w:eastAsia="Avenir Next" w:hAnsi="Avenir Next"/>
                       <w:b w:val="false"/>
                       <w:bCs w:val="false"/>
                       <w:i w:val="false"/>
@@ -467,11 +467,11 @@
                 </w:tcPr>
                 <w:p>
                   <w:pPr>
-                    <w:spacing w:after="40"/>
-                  </w:pPr>
-                  <w:r>
-                    <w:rPr>
-                      <w:rFonts w:ascii="Calibri" w:cs="Calibri" w:eastAsia="Times New Roman" w:hAnsi="Calibri"/>
+                    <w:spacing w:after="40" w:line="204" w:lineRule="auto"/>
+                  </w:pPr>
+                  <w:r>
+                    <w:rPr>
+                      <w:rFonts w:ascii="Avenir Next" w:cs="Avenir Next" w:eastAsia="Avenir Next" w:hAnsi="Avenir Next"/>
                       <w:b w:val="false"/>
                       <w:bCs w:val="false"/>
                       <w:i w:val="false"/>
@@ -495,11 +495,11 @@
                 </w:tcPr>
                 <w:p>
                   <w:pPr>
-                    <w:spacing w:after="40"/>
-                  </w:pPr>
-                  <w:r>
-                    <w:rPr>
-                      <w:rFonts w:ascii="Calibri" w:cs="Calibri" w:eastAsia="Times New Roman" w:hAnsi="Calibri"/>
+                    <w:spacing w:after="40" w:line="204" w:lineRule="auto"/>
+                  </w:pPr>
+                  <w:r>
+                    <w:rPr>
+                      <w:rFonts w:ascii="Avenir Next" w:cs="Avenir Next" w:eastAsia="Avenir Next" w:hAnsi="Avenir Next"/>
                       <w:b w:val="false"/>
                       <w:bCs w:val="false"/>
                       <w:i w:val="false"/>
@@ -526,11 +526,11 @@
                 </w:tcPr>
                 <w:p>
                   <w:pPr>
-                    <w:spacing w:after="40"/>
-                  </w:pPr>
-                  <w:r>
-                    <w:rPr>
-                      <w:rFonts w:ascii="Calibri" w:cs="Calibri" w:eastAsia="Times New Roman" w:hAnsi="Calibri"/>
+                    <w:spacing w:after="40" w:line="204" w:lineRule="auto"/>
+                  </w:pPr>
+                  <w:r>
+                    <w:rPr>
+                      <w:rFonts w:ascii="Avenir Next" w:cs="Avenir Next" w:eastAsia="Avenir Next" w:hAnsi="Avenir Next"/>
                       <w:b w:val="false"/>
                       <w:bCs w:val="false"/>
                       <w:i w:val="false"/>
@@ -554,11 +554,11 @@
                 </w:tcPr>
                 <w:p>
                   <w:pPr>
-                    <w:spacing w:after="40"/>
-                  </w:pPr>
-                  <w:r>
-                    <w:rPr>
-                      <w:rFonts w:ascii="Calibri" w:cs="Calibri" w:eastAsia="Times New Roman" w:hAnsi="Calibri"/>
+                    <w:spacing w:after="40" w:line="204" w:lineRule="auto"/>
+                  </w:pPr>
+                  <w:r>
+                    <w:rPr>
+                      <w:rFonts w:ascii="Avenir Next" w:cs="Avenir Next" w:eastAsia="Avenir Next" w:hAnsi="Avenir Next"/>
                       <w:b w:val="false"/>
                       <w:bCs w:val="false"/>
                       <w:i w:val="false"/>
@@ -585,11 +585,11 @@
                 </w:tcPr>
                 <w:p>
                   <w:pPr>
-                    <w:spacing w:after="40"/>
-                  </w:pPr>
-                  <w:r>
-                    <w:rPr>
-                      <w:rFonts w:ascii="Calibri" w:cs="Calibri" w:eastAsia="Times New Roman" w:hAnsi="Calibri"/>
+                    <w:spacing w:after="40" w:line="204" w:lineRule="auto"/>
+                  </w:pPr>
+                  <w:r>
+                    <w:rPr>
+                      <w:rFonts w:ascii="Avenir Next" w:cs="Avenir Next" w:eastAsia="Avenir Next" w:hAnsi="Avenir Next"/>
                       <w:b w:val="false"/>
                       <w:bCs w:val="false"/>
                       <w:i w:val="false"/>
@@ -613,11 +613,11 @@
                 </w:tcPr>
                 <w:p>
                   <w:pPr>
-                    <w:spacing w:after="40"/>
-                  </w:pPr>
-                  <w:r>
-                    <w:rPr>
-                      <w:rFonts w:ascii="Calibri" w:cs="Calibri" w:eastAsia="Times New Roman" w:hAnsi="Calibri"/>
+                    <w:spacing w:after="40" w:line="204" w:lineRule="auto"/>
+                  </w:pPr>
+                  <w:r>
+                    <w:rPr>
+                      <w:rFonts w:ascii="Avenir Next" w:cs="Avenir Next" w:eastAsia="Avenir Next" w:hAnsi="Avenir Next"/>
                       <w:b w:val="false"/>
                       <w:bCs w:val="false"/>
                       <w:i w:val="false"/>
@@ -644,11 +644,11 @@
                 </w:tcPr>
                 <w:p>
                   <w:pPr>
-                    <w:spacing w:after="40"/>
-                  </w:pPr>
-                  <w:r>
-                    <w:rPr>
-                      <w:rFonts w:ascii="Calibri" w:cs="Calibri" w:eastAsia="Times New Roman" w:hAnsi="Calibri"/>
+                    <w:spacing w:after="40" w:line="204" w:lineRule="auto"/>
+                  </w:pPr>
+                  <w:r>
+                    <w:rPr>
+                      <w:rFonts w:ascii="Avenir Next" w:cs="Avenir Next" w:eastAsia="Avenir Next" w:hAnsi="Avenir Next"/>
                       <w:b w:val="false"/>
                       <w:bCs w:val="false"/>
                       <w:i w:val="false"/>
@@ -672,11 +672,11 @@
                 </w:tcPr>
                 <w:p>
                   <w:pPr>
-                    <w:spacing w:after="40"/>
-                  </w:pPr>
-                  <w:r>
-                    <w:rPr>
-                      <w:rFonts w:ascii="Calibri" w:cs="Calibri" w:eastAsia="Times New Roman" w:hAnsi="Calibri"/>
+                    <w:spacing w:after="40" w:line="204" w:lineRule="auto"/>
+                  </w:pPr>
+                  <w:r>
+                    <w:rPr>
+                      <w:rFonts w:ascii="Avenir Next" w:cs="Avenir Next" w:eastAsia="Avenir Next" w:hAnsi="Avenir Next"/>
                       <w:b w:val="false"/>
                       <w:bCs w:val="false"/>
                       <w:i w:val="false"/>
@@ -703,11 +703,11 @@
                 </w:tcPr>
                 <w:p>
                   <w:pPr>
-                    <w:spacing w:after="40"/>
-                  </w:pPr>
-                  <w:r>
-                    <w:rPr>
-                      <w:rFonts w:ascii="Calibri" w:cs="Calibri" w:eastAsia="Times New Roman" w:hAnsi="Calibri"/>
+                    <w:spacing w:after="40" w:line="204" w:lineRule="auto"/>
+                  </w:pPr>
+                  <w:r>
+                    <w:rPr>
+                      <w:rFonts w:ascii="Avenir Next" w:cs="Avenir Next" w:eastAsia="Avenir Next" w:hAnsi="Avenir Next"/>
                       <w:b w:val="false"/>
                       <w:bCs w:val="false"/>
                       <w:i w:val="false"/>
@@ -731,11 +731,11 @@
                 </w:tcPr>
                 <w:p>
                   <w:pPr>
-                    <w:spacing w:after="40"/>
-                  </w:pPr>
-                  <w:r>
-                    <w:rPr>
-                      <w:rFonts w:ascii="Calibri" w:cs="Calibri" w:eastAsia="Times New Roman" w:hAnsi="Calibri"/>
+                    <w:spacing w:after="40" w:line="204" w:lineRule="auto"/>
+                  </w:pPr>
+                  <w:r>
+                    <w:rPr>
+                      <w:rFonts w:ascii="Avenir Next" w:cs="Avenir Next" w:eastAsia="Avenir Next" w:hAnsi="Avenir Next"/>
                       <w:b w:val="false"/>
                       <w:bCs w:val="false"/>
                       <w:i w:val="false"/>
@@ -762,11 +762,11 @@
                 </w:tcPr>
                 <w:p>
                   <w:pPr>
-                    <w:spacing w:after="40"/>
-                  </w:pPr>
-                  <w:r>
-                    <w:rPr>
-                      <w:rFonts w:ascii="Calibri" w:cs="Calibri" w:eastAsia="Times New Roman" w:hAnsi="Calibri"/>
+                    <w:spacing w:after="40" w:line="204" w:lineRule="auto"/>
+                  </w:pPr>
+                  <w:r>
+                    <w:rPr>
+                      <w:rFonts w:ascii="Avenir Next" w:cs="Avenir Next" w:eastAsia="Avenir Next" w:hAnsi="Avenir Next"/>
                       <w:b w:val="false"/>
                       <w:bCs w:val="false"/>
                       <w:i w:val="false"/>
@@ -790,11 +790,11 @@
                 </w:tcPr>
                 <w:p>
                   <w:pPr>
-                    <w:spacing w:after="40"/>
-                  </w:pPr>
-                  <w:r>
-                    <w:rPr>
-                      <w:rFonts w:ascii="Calibri" w:cs="Calibri" w:eastAsia="Times New Roman" w:hAnsi="Calibri"/>
+                    <w:spacing w:after="40" w:line="204" w:lineRule="auto"/>
+                  </w:pPr>
+                  <w:r>
+                    <w:rPr>
+                      <w:rFonts w:ascii="Avenir Next" w:cs="Avenir Next" w:eastAsia="Avenir Next" w:hAnsi="Avenir Next"/>
                       <w:b w:val="false"/>
                       <w:bCs w:val="false"/>
                       <w:i w:val="false"/>
@@ -821,11 +821,11 @@
                 </w:tcPr>
                 <w:p>
                   <w:pPr>
-                    <w:spacing w:after="40"/>
-                  </w:pPr>
-                  <w:r>
-                    <w:rPr>
-                      <w:rFonts w:ascii="Calibri" w:cs="Calibri" w:eastAsia="Times New Roman" w:hAnsi="Calibri"/>
+                    <w:spacing w:after="40" w:line="204" w:lineRule="auto"/>
+                  </w:pPr>
+                  <w:r>
+                    <w:rPr>
+                      <w:rFonts w:ascii="Avenir Next" w:cs="Avenir Next" w:eastAsia="Avenir Next" w:hAnsi="Avenir Next"/>
                       <w:b w:val="false"/>
                       <w:bCs w:val="false"/>
                       <w:i w:val="false"/>
@@ -849,11 +849,11 @@
                 </w:tcPr>
                 <w:p>
                   <w:pPr>
-                    <w:spacing w:after="40"/>
-                  </w:pPr>
-                  <w:r>
-                    <w:rPr>
-                      <w:rFonts w:ascii="Calibri" w:cs="Calibri" w:eastAsia="Times New Roman" w:hAnsi="Calibri"/>
+                    <w:spacing w:after="40" w:line="204" w:lineRule="auto"/>
+                  </w:pPr>
+                  <w:r>
+                    <w:rPr>
+                      <w:rFonts w:ascii="Avenir Next" w:cs="Avenir Next" w:eastAsia="Avenir Next" w:hAnsi="Avenir Next"/>
                       <w:b w:val="false"/>
                       <w:bCs w:val="false"/>
                       <w:i w:val="false"/>
@@ -869,11 +869,11 @@
           </w:tbl>
           <w:p>
             <w:pPr>
-              <w:spacing w:after="60"/>
+              <w:spacing w:after="60" w:line="204" w:lineRule="auto"/>
             </w:pPr>
             <w:r>
               <w:rPr>
-                <w:rFonts w:ascii="Calibri" w:cs="Calibri" w:eastAsia="Times New Roman" w:hAnsi="Calibri"/>
+                <w:rFonts w:ascii="Avenir Next" w:cs="Avenir Next" w:eastAsia="Avenir Next" w:hAnsi="Avenir Next"/>
                 <w:b w:val="false"/>
                 <w:bCs w:val="false"/>
                 <w:i w:val="false"/>
@@ -888,12 +888,12 @@
             <w:tblPr>
               <w:tblW w:type="dxa" w:w="3400"/>
               <w:tblBorders>
-                <w:top w:val="single" w:color="000000" w:sz="4"/>
-                <w:left w:val="single" w:color="000000" w:sz="4"/>
-                <w:bottom w:val="single" w:color="000000" w:sz="4"/>
-                <w:right w:val="single" w:color="000000" w:sz="4"/>
-                <w:insideH w:val="single" w:color="000000" w:sz="4"/>
-                <w:insideV w:val="single" w:color="000000" w:sz="4"/>
+                <w:top w:val="single" w:color="9D9FA2" w:sz="4"/>
+                <w:left w:val="single" w:color="9D9FA2" w:sz="4"/>
+                <w:bottom w:val="single" w:color="9D9FA2" w:sz="4"/>
+                <w:right w:val="single" w:color="9D9FA2" w:sz="4"/>
+                <w:insideH w:val="single" w:color="9D9FA2" w:sz="4"/>
+                <w:insideV w:val="single" w:color="9D9FA2" w:sz="4"/>
               </w:tblBorders>
             </w:tblPr>
             <w:tblGrid>
@@ -914,11 +914,11 @@
                 </w:tcPr>
                 <w:p>
                   <w:pPr>
-                    <w:spacing w:after="40"/>
-                  </w:pPr>
-                  <w:r>
-                    <w:rPr>
-                      <w:rFonts w:ascii="Calibri" w:cs="Calibri" w:eastAsia="Times New Roman" w:hAnsi="Calibri"/>
+                    <w:spacing w:after="40" w:line="204" w:lineRule="auto"/>
+                  </w:pPr>
+                  <w:r>
+                    <w:rPr>
+                      <w:rFonts w:ascii="Avenir Next Condensed" w:cs="Avenir Next Condensed" w:eastAsia="Avenir Next Condensed" w:hAnsi="Avenir Next Condensed"/>
                       <w:b/>
                       <w:bCs/>
                       <w:i w:val="false"/>
@@ -943,11 +943,11 @@
                 </w:tcPr>
                 <w:p>
                   <w:pPr>
-                    <w:spacing w:after="40"/>
-                  </w:pPr>
-                  <w:r>
-                    <w:rPr>
-                      <w:rFonts w:ascii="Calibri" w:cs="Calibri" w:eastAsia="Times New Roman" w:hAnsi="Calibri"/>
+                    <w:spacing w:after="40" w:line="204" w:lineRule="auto"/>
+                  </w:pPr>
+                  <w:r>
+                    <w:rPr>
+                      <w:rFonts w:ascii="Avenir Next" w:cs="Avenir Next" w:eastAsia="Avenir Next" w:hAnsi="Avenir Next"/>
                       <w:b w:val="false"/>
                       <w:bCs w:val="false"/>
                       <w:i w:val="false"/>
@@ -974,11 +974,11 @@
                 </w:tcPr>
                 <w:p>
                   <w:pPr>
-                    <w:spacing w:after="40"/>
-                  </w:pPr>
-                  <w:r>
-                    <w:rPr>
-                      <w:rFonts w:ascii="Calibri" w:cs="Calibri" w:eastAsia="Times New Roman" w:hAnsi="Calibri"/>
+                    <w:spacing w:after="40" w:line="204" w:lineRule="auto"/>
+                  </w:pPr>
+                  <w:r>
+                    <w:rPr>
+                      <w:rFonts w:ascii="Avenir Next Condensed" w:cs="Avenir Next Condensed" w:eastAsia="Avenir Next Condensed" w:hAnsi="Avenir Next Condensed"/>
                       <w:b/>
                       <w:bCs/>
                       <w:i w:val="false"/>
@@ -1003,11 +1003,11 @@
                 </w:tcPr>
                 <w:p>
                   <w:pPr>
-                    <w:spacing w:after="40"/>
-                  </w:pPr>
-                  <w:r>
-                    <w:rPr>
-                      <w:rFonts w:ascii="Calibri" w:cs="Calibri" w:eastAsia="Times New Roman" w:hAnsi="Calibri"/>
+                    <w:spacing w:after="40" w:line="204" w:lineRule="auto"/>
+                  </w:pPr>
+                  <w:r>
+                    <w:rPr>
+                      <w:rFonts w:ascii="Avenir Next" w:cs="Avenir Next" w:eastAsia="Avenir Next" w:hAnsi="Avenir Next"/>
                       <w:b w:val="false"/>
                       <w:bCs w:val="false"/>
                       <w:i w:val="false"/>
@@ -1023,11 +1023,11 @@
           </w:tbl>
           <w:p>
             <w:pPr>
-              <w:spacing w:after="60"/>
+              <w:spacing w:after="60" w:line="204" w:lineRule="auto"/>
             </w:pPr>
             <w:r>
               <w:rPr>
-                <w:rFonts w:ascii="Calibri" w:cs="Calibri" w:eastAsia="Times New Roman" w:hAnsi="Calibri"/>
+                <w:rFonts w:ascii="Avenir Next" w:cs="Avenir Next" w:eastAsia="Avenir Next" w:hAnsi="Avenir Next"/>
                 <w:b w:val="false"/>
                 <w:bCs w:val="false"/>
                 <w:i w:val="false"/>
@@ -1040,11 +1040,11 @@
           </w:p>
           <w:p>
             <w:pPr>
-              <w:spacing w:after="40"/>
+              <w:spacing w:after="40" w:line="204" w:lineRule="auto"/>
             </w:pPr>
             <w:r>
               <w:rPr>
-                <w:rFonts w:ascii="Calibri" w:cs="Calibri" w:eastAsia="Times New Roman" w:hAnsi="Calibri"/>
+                <w:rFonts w:ascii="Avenir Next Condensed" w:cs="Avenir Next Condensed" w:eastAsia="Avenir Next Condensed" w:hAnsi="Avenir Next Condensed"/>
                 <w:b/>
                 <w:bCs/>
                 <w:i w:val="false"/>
@@ -1057,11 +1057,11 @@
           </w:p>
           <w:p>
             <w:pPr>
-              <w:spacing w:after="60"/>
+              <w:spacing w:after="60" w:line="204" w:lineRule="auto"/>
             </w:pPr>
             <w:r>
               <w:rPr>
-                <w:rFonts w:ascii="Calibri" w:cs="Calibri" w:eastAsia="Times New Roman" w:hAnsi="Calibri"/>
+                <w:rFonts w:ascii="Avenir Next" w:cs="Avenir Next" w:eastAsia="Avenir Next" w:hAnsi="Avenir Next"/>
                 <w:b w:val="false"/>
                 <w:bCs w:val="false"/>
                 <w:i/>
@@ -1074,7 +1074,7 @@
           </w:p>
           <w:p>
             <w:pPr>
-              <w:spacing w:after="20"/>
+              <w:spacing w:after="20" w:line="204" w:lineRule="auto"/>
             </w:pPr>
             <w:sdt>
               <w:sdtPr>
@@ -1088,13 +1088,16 @@
               <w:sdtEndPr/>
               <w:sdtContent>
                 <w:r>
+                  <w:rPr>
+                    <w:rFonts w:ascii="Avenir Next" w:hAnsi="Avenir Next" w:cs="Avenir Next" w:eastAsia="Avenir Next"/>
+                  </w:rPr>
                   <w:t>☒</w:t>
                 </w:r>
               </w:sdtContent>
             </w:sdt>
             <w:r>
               <w:rPr>
-                <w:rFonts w:ascii="Calibri" w:cs="Calibri" w:eastAsia="Times New Roman" w:hAnsi="Calibri"/>
+                <w:rFonts w:ascii="Avenir Next" w:cs="Avenir Next" w:eastAsia="Avenir Next" w:hAnsi="Avenir Next"/>
                 <w:b w:val="false"/>
                 <w:bCs w:val="false"/>
                 <w:i w:val="false"/>
@@ -1107,7 +1110,7 @@
           </w:p>
           <w:p>
             <w:pPr>
-              <w:spacing w:after="60"/>
+              <w:spacing w:after="60" w:line="204" w:lineRule="auto"/>
             </w:pPr>
             <w:sdt>
               <w:sdtPr>
@@ -1121,13 +1124,16 @@
               <w:sdtEndPr/>
               <w:sdtContent>
                 <w:r>
+                  <w:rPr>
+                    <w:rFonts w:ascii="Avenir Next" w:hAnsi="Avenir Next" w:cs="Avenir Next" w:eastAsia="Avenir Next"/>
+                  </w:rPr>
                   <w:t>☒</w:t>
                 </w:r>
               </w:sdtContent>
             </w:sdt>
             <w:r>
               <w:rPr>
-                <w:rFonts w:ascii="Calibri" w:cs="Calibri" w:eastAsia="Times New Roman" w:hAnsi="Calibri"/>
+                <w:rFonts w:ascii="Avenir Next" w:cs="Avenir Next" w:eastAsia="Avenir Next" w:hAnsi="Avenir Next"/>
                 <w:b w:val="false"/>
                 <w:bCs w:val="false"/>
                 <w:i w:val="false"/>
@@ -1140,11 +1146,11 @@
           </w:p>
           <w:p>
             <w:pPr>
-              <w:spacing w:after="60"/>
+              <w:spacing w:after="60" w:line="204" w:lineRule="auto"/>
             </w:pPr>
             <w:r>
               <w:rPr>
-                <w:rFonts w:ascii="Calibri" w:cs="Calibri" w:eastAsia="Times New Roman" w:hAnsi="Calibri"/>
+                <w:rFonts w:ascii="Avenir Next" w:cs="Avenir Next" w:eastAsia="Avenir Next" w:hAnsi="Avenir Next"/>
                 <w:b w:val="false"/>
                 <w:bCs w:val="false"/>
                 <w:i/>
@@ -1157,7 +1163,7 @@
           </w:p>
           <w:p>
             <w:pPr>
-              <w:spacing w:after="140"/>
+              <w:spacing w:after="140" w:line="204" w:lineRule="auto"/>
             </w:pPr>
             <w:sdt>
               <w:sdtPr>
@@ -1171,13 +1177,16 @@
               <w:sdtEndPr/>
               <w:sdtContent>
                 <w:r>
+                  <w:rPr>
+                    <w:rFonts w:ascii="Avenir Next" w:hAnsi="Avenir Next" w:cs="Avenir Next" w:eastAsia="Avenir Next"/>
+                  </w:rPr>
                   <w:t>☐</w:t>
                 </w:r>
               </w:sdtContent>
             </w:sdt>
             <w:r>
               <w:rPr>
-                <w:rFonts w:ascii="Calibri" w:cs="Calibri" w:eastAsia="Times New Roman" w:hAnsi="Calibri"/>
+                <w:rFonts w:ascii="Avenir Next" w:cs="Avenir Next" w:eastAsia="Avenir Next" w:hAnsi="Avenir Next"/>
                 <w:b w:val="false"/>
                 <w:bCs w:val="false"/>
                 <w:i w:val="false"/>
@@ -1190,11 +1199,11 @@
           </w:p>
           <w:p>
             <w:pPr>
-              <w:spacing w:after="40"/>
+              <w:spacing w:after="40" w:line="204" w:lineRule="auto"/>
             </w:pPr>
             <w:r>
               <w:rPr>
-                <w:rFonts w:ascii="Calibri" w:cs="Calibri" w:eastAsia="Times New Roman" w:hAnsi="Calibri"/>
+                <w:rFonts w:ascii="Avenir Next" w:cs="Avenir Next" w:eastAsia="Avenir Next" w:hAnsi="Avenir Next"/>
                 <w:b/>
                 <w:bCs/>
                 <w:i w:val="false"/>
@@ -1221,12 +1230,12 @@
             <w:tblPr>
               <w:tblW w:type="dxa" w:w="7300"/>
               <w:tblBorders>
-                <w:top w:val="single" w:color="000000" w:sz="4"/>
-                <w:left w:val="single" w:color="000000" w:sz="4"/>
-                <w:bottom w:val="single" w:color="000000" w:sz="4"/>
-                <w:right w:val="single" w:color="000000" w:sz="4"/>
-                <w:insideH w:val="single" w:color="000000" w:sz="4"/>
-                <w:insideV w:val="single" w:color="000000" w:sz="4"/>
+                <w:top w:val="single" w:color="9D9FA2" w:sz="4"/>
+                <w:left w:val="single" w:color="9D9FA2" w:sz="4"/>
+                <w:bottom w:val="single" w:color="9D9FA2" w:sz="4"/>
+                <w:right w:val="single" w:color="9D9FA2" w:sz="4"/>
+                <w:insideH w:val="single" w:color="9D9FA2" w:sz="4"/>
+                <w:insideV w:val="single" w:color="9D9FA2" w:sz="4"/>
               </w:tblBorders>
             </w:tblPr>
             <w:tblGrid>
@@ -1239,28 +1248,29 @@
               <w:tc>
                 <w:tcPr>
                   <w:tcW w:type="dxa" w:w="1750"/>
-                  <w:shd w:fill="EAE7DD" w:color="auto" w:val="clear"/>
-                  <w:tcMar>
-                    <w:top w:type="dxa" w:w="40"/>
-                    <w:left w:type="dxa" w:w="80"/>
-                    <w:bottom w:type="dxa" w:w="40"/>
-                    <w:right w:type="dxa" w:w="80"/>
-                  </w:tcMar>
-                  <w:vAlign w:val="top"/>
-                </w:tcPr>
-                <w:p>
-                  <w:pPr>
-                    <w:spacing w:after="0"/>
-                  </w:pPr>
-                  <w:r>
-                    <w:rPr>
-                      <w:rFonts w:ascii="Calibri" w:cs="Calibri" w:eastAsia="Times New Roman" w:hAnsi="Calibri"/>
+                  <w:shd w:fill="595A5C" w:color="auto" w:val="clear"/>
+                  <w:tcMar>
+                    <w:top w:type="dxa" w:w="40"/>
+                    <w:left w:type="dxa" w:w="80"/>
+                    <w:bottom w:type="dxa" w:w="40"/>
+                    <w:right w:type="dxa" w:w="80"/>
+                  </w:tcMar>
+                  <w:vAlign w:val="top"/>
+                </w:tcPr>
+                <w:p>
+                  <w:pPr>
+                    <w:spacing w:after="0" w:line="204" w:lineRule="auto"/>
+                  </w:pPr>
+                  <w:r>
+                    <w:rPr>
+                      <w:rFonts w:ascii="Avenir Next Condensed" w:cs="Avenir Next Condensed" w:eastAsia="Avenir Next Condensed" w:hAnsi="Avenir Next Condensed"/>
                       <w:b/>
                       <w:bCs/>
                       <w:i w:val="false"/>
                       <w:iCs w:val="false"/>
                       <w:sz w:val="20"/>
                       <w:szCs w:val="20"/>
+                      <w:color w:val="FFFFFF"/>
                     </w:rPr>
                     <w:t xml:space="preserve">EVENT INFORMATION</w:t>
                   </w:r>
@@ -1270,22 +1280,22 @@
                 <w:tcPr>
                   <w:tcW w:type="dxa" w:w="5550"/>
                   <w:gridSpan w:val="3"/>
-                  <w:shd w:fill="EAE7DD" w:color="auto" w:val="clear"/>
-                  <w:tcMar>
-                    <w:top w:type="dxa" w:w="40"/>
-                    <w:left w:type="dxa" w:w="80"/>
-                    <w:bottom w:type="dxa" w:w="40"/>
-                    <w:right w:type="dxa" w:w="80"/>
-                  </w:tcMar>
-                  <w:vAlign w:val="top"/>
-                </w:tcPr>
-                <w:p>
-                  <w:pPr>
-                    <w:spacing w:after="0"/>
-                  </w:pPr>
-                  <w:r>
-                    <w:rPr>
-                      <w:rFonts w:ascii="Calibri" w:cs="Calibri" w:eastAsia="Times New Roman" w:hAnsi="Calibri"/>
+                  <w:shd w:fill="EEEEEF" w:color="auto" w:val="clear"/>
+                  <w:tcMar>
+                    <w:top w:type="dxa" w:w="40"/>
+                    <w:left w:type="dxa" w:w="80"/>
+                    <w:bottom w:type="dxa" w:w="40"/>
+                    <w:right w:type="dxa" w:w="80"/>
+                  </w:tcMar>
+                  <w:vAlign w:val="top"/>
+                </w:tcPr>
+                <w:p>
+                  <w:pPr>
+                    <w:spacing w:after="0" w:line="204" w:lineRule="auto"/>
+                  </w:pPr>
+                  <w:r>
+                    <w:rPr>
+                      <w:rFonts w:ascii="Avenir Next" w:cs="Avenir Next" w:eastAsia="Avenir Next" w:hAnsi="Avenir Next"/>
                       <w:b w:val="false"/>
                       <w:bCs w:val="false"/>
                       <w:i w:val="false"/>
@@ -1298,11 +1308,11 @@
                 </w:p>
                 <w:p>
                   <w:pPr>
-                    <w:spacing w:after="0"/>
-                  </w:pPr>
-                  <w:r>
-                    <w:rPr>
-                      <w:rFonts w:ascii="Calibri" w:cs="Calibri" w:eastAsia="Times New Roman" w:hAnsi="Calibri"/>
+                    <w:spacing w:after="0" w:line="204" w:lineRule="auto"/>
+                  </w:pPr>
+                  <w:r>
+                    <w:rPr>
+                      <w:rFonts w:ascii="Avenir Next" w:cs="Avenir Next" w:eastAsia="Avenir Next" w:hAnsi="Avenir Next"/>
                       <w:b w:val="false"/>
                       <w:bCs w:val="false"/>
                       <w:i w:val="false"/>
@@ -1315,11 +1325,11 @@
                 </w:p>
                 <w:p>
                   <w:pPr>
-                    <w:spacing w:after="0"/>
-                  </w:pPr>
-                  <w:r>
-                    <w:rPr>
-                      <w:rFonts w:ascii="Calibri" w:cs="Calibri" w:eastAsia="Times New Roman" w:hAnsi="Calibri"/>
+                    <w:spacing w:after="0" w:line="204" w:lineRule="auto"/>
+                  </w:pPr>
+                  <w:r>
+                    <w:rPr>
+                      <w:rFonts w:ascii="Avenir Next" w:cs="Avenir Next" w:eastAsia="Avenir Next" w:hAnsi="Avenir Next"/>
                       <w:b w:val="false"/>
                       <w:bCs w:val="false"/>
                       <w:i w:val="false"/>
@@ -1332,11 +1342,11 @@
                 </w:p>
                 <w:p>
                   <w:pPr>
-                    <w:spacing w:after="0"/>
-                  </w:pPr>
-                  <w:r>
-                    <w:rPr>
-                      <w:rFonts w:ascii="Calibri" w:cs="Calibri" w:eastAsia="Times New Roman" w:hAnsi="Calibri"/>
+                    <w:spacing w:after="0" w:line="204" w:lineRule="auto"/>
+                  </w:pPr>
+                  <w:r>
+                    <w:rPr>
+                      <w:rFonts w:ascii="Avenir Next" w:cs="Avenir Next" w:eastAsia="Avenir Next" w:hAnsi="Avenir Next"/>
                       <w:b w:val="false"/>
                       <w:bCs w:val="false"/>
                       <w:i w:val="false"/>
@@ -1349,11 +1359,11 @@
                 </w:p>
                 <w:p>
                   <w:pPr>
-                    <w:spacing w:after="0"/>
-                  </w:pPr>
-                  <w:r>
-                    <w:rPr>
-                      <w:rFonts w:ascii="Calibri" w:cs="Calibri" w:eastAsia="Times New Roman" w:hAnsi="Calibri"/>
+                    <w:spacing w:after="0" w:line="204" w:lineRule="auto"/>
+                  </w:pPr>
+                  <w:r>
+                    <w:rPr>
+                      <w:rFonts w:ascii="Avenir Next" w:cs="Avenir Next" w:eastAsia="Avenir Next" w:hAnsi="Avenir Next"/>
                       <w:b/>
                       <w:bCs/>
                       <w:i w:val="false"/>
@@ -1365,7 +1375,7 @@
                   </w:r>
                   <w:r>
                     <w:rPr>
-                      <w:rFonts w:ascii="Calibri" w:cs="Calibri" w:eastAsia="Times New Roman" w:hAnsi="Calibri"/>
+                      <w:rFonts w:ascii="Avenir Next" w:cs="Avenir Next" w:eastAsia="Avenir Next" w:hAnsi="Avenir Next"/>
                       <w:b/>
                       <w:bCs/>
                       <w:i w:val="false"/>
@@ -1392,11 +1402,11 @@
                 </w:tcPr>
                 <w:p>
                   <w:pPr>
-                    <w:spacing w:after="0"/>
-                  </w:pPr>
-                  <w:r>
-                    <w:rPr>
-                      <w:rFonts w:ascii="Calibri" w:cs="Calibri" w:eastAsia="Times New Roman" w:hAnsi="Calibri"/>
+                    <w:spacing w:after="0" w:line="204" w:lineRule="auto"/>
+                  </w:pPr>
+                  <w:r>
+                    <w:rPr>
+                      <w:rFonts w:ascii="Avenir Next Condensed" w:cs="Avenir Next Condensed" w:eastAsia="Avenir Next Condensed" w:hAnsi="Avenir Next Condensed"/>
                       <w:b/>
                       <w:bCs/>
                       <w:i w:val="false"/>
@@ -1422,7 +1432,7 @@
                 </w:tcPr>
                 <w:p>
                   <w:pPr>
-                    <w:spacing w:after="0"/>
+                    <w:spacing w:after="0" w:line="204" w:lineRule="auto"/>
                   </w:pPr>
                   <w:sdt>
                     <w:sdtPr>
@@ -1436,13 +1446,16 @@
                     <w:sdtEndPr/>
                     <w:sdtContent>
                       <w:r>
+                        <w:rPr>
+                          <w:rFonts w:ascii="Avenir Next" w:hAnsi="Avenir Next" w:cs="Avenir Next" w:eastAsia="Avenir Next"/>
+                        </w:rPr>
                         <w:t>☐</w:t>
                       </w:r>
                     </w:sdtContent>
                   </w:sdt>
                   <w:r>
                     <w:rPr>
-                      <w:rFonts w:ascii="Calibri" w:hAnsi="Calibri" w:cs="Calibri"/>
+                      <w:rFonts w:ascii="Avenir Next" w:hAnsi="Avenir Next" w:cs="Avenir Next" w:eastAsia="Avenir Next"/>
                     </w:rPr>
                     <w:t xml:space="preserve"> Internal Event:     </w:t>
                   </w:r>
@@ -1458,24 +1471,27 @@
                     <w:sdtEndPr/>
                     <w:sdtContent>
                       <w:r>
+                        <w:rPr>
+                          <w:rFonts w:ascii="Avenir Next" w:hAnsi="Avenir Next" w:cs="Avenir Next" w:eastAsia="Avenir Next"/>
+                        </w:rPr>
                         <w:t>☐</w:t>
                       </w:r>
                     </w:sdtContent>
                   </w:sdt>
                   <w:r>
                     <w:rPr>
-                      <w:rFonts w:ascii="Calibri" w:hAnsi="Calibri" w:cs="Calibri"/>
+                      <w:rFonts w:ascii="Avenir Next" w:hAnsi="Avenir Next" w:cs="Avenir Next" w:eastAsia="Avenir Next"/>
                     </w:rPr>
                     <w:t xml:space="preserve"> Third Party Event:</w:t>
                   </w:r>
                 </w:p>
                 <w:p>
                   <w:pPr>
-                    <w:spacing w:after="0"/>
-                  </w:pPr>
-                  <w:r>
-                    <w:rPr>
-                      <w:rFonts w:ascii="Calibri" w:hAnsi="Calibri" w:cs="Calibri"/>
+                    <w:spacing w:after="0" w:line="204" w:lineRule="auto"/>
+                  </w:pPr>
+                  <w:r>
+                    <w:rPr>
+                      <w:rFonts w:ascii="Avenir Next" w:hAnsi="Avenir Next" w:cs="Avenir Next" w:eastAsia="Avenir Next"/>
                     </w:rPr>
                     <w:t xml:space="preserve">Are we paying the band?   </w:t>
                   </w:r>
@@ -1491,13 +1507,16 @@
                     <w:sdtEndPr/>
                     <w:sdtContent>
                       <w:r>
+                        <w:rPr>
+                          <w:rFonts w:ascii="Avenir Next" w:hAnsi="Avenir Next" w:cs="Avenir Next" w:eastAsia="Avenir Next"/>
+                        </w:rPr>
                         <w:t>☐</w:t>
                       </w:r>
                     </w:sdtContent>
                   </w:sdt>
                   <w:r>
                     <w:rPr>
-                      <w:rFonts w:ascii="Calibri" w:hAnsi="Calibri" w:cs="Calibri"/>
+                      <w:rFonts w:ascii="Avenir Next" w:hAnsi="Avenir Next" w:cs="Avenir Next" w:eastAsia="Avenir Next"/>
                     </w:rPr>
                     <w:t xml:space="preserve"> Yes     </w:t>
                   </w:r>
@@ -1513,13 +1532,16 @@
                     <w:sdtEndPr/>
                     <w:sdtContent>
                       <w:r>
+                        <w:rPr>
+                          <w:rFonts w:ascii="Avenir Next" w:hAnsi="Avenir Next" w:cs="Avenir Next" w:eastAsia="Avenir Next"/>
+                        </w:rPr>
                         <w:t>☐</w:t>
                       </w:r>
                     </w:sdtContent>
                   </w:sdt>
                   <w:r>
                     <w:rPr>
-                      <w:rFonts w:ascii="Calibri" w:hAnsi="Calibri" w:cs="Calibri"/>
+                      <w:rFonts w:ascii="Avenir Next" w:hAnsi="Avenir Next" w:cs="Avenir Next" w:eastAsia="Avenir Next"/>
                     </w:rPr>
                     <w:t xml:space="preserve"> No</w:t>
                   </w:r>
@@ -1530,28 +1552,29 @@
               <w:tc>
                 <w:tcPr>
                   <w:tcW w:type="dxa" w:w="1750"/>
-                  <w:shd w:fill="EAE7DD" w:color="auto" w:val="clear"/>
-                  <w:tcMar>
-                    <w:top w:type="dxa" w:w="40"/>
-                    <w:left w:type="dxa" w:w="80"/>
-                    <w:bottom w:type="dxa" w:w="40"/>
-                    <w:right w:type="dxa" w:w="80"/>
-                  </w:tcMar>
-                  <w:vAlign w:val="top"/>
-                </w:tcPr>
-                <w:p>
-                  <w:pPr>
-                    <w:spacing w:after="0"/>
-                  </w:pPr>
-                  <w:r>
-                    <w:rPr>
-                      <w:rFonts w:ascii="Calibri" w:cs="Calibri" w:eastAsia="Times New Roman" w:hAnsi="Calibri"/>
+                  <w:shd w:fill="595A5C" w:color="auto" w:val="clear"/>
+                  <w:tcMar>
+                    <w:top w:type="dxa" w:w="40"/>
+                    <w:left w:type="dxa" w:w="80"/>
+                    <w:bottom w:type="dxa" w:w="40"/>
+                    <w:right w:type="dxa" w:w="80"/>
+                  </w:tcMar>
+                  <w:vAlign w:val="top"/>
+                </w:tcPr>
+                <w:p>
+                  <w:pPr>
+                    <w:spacing w:after="0" w:line="204" w:lineRule="auto"/>
+                  </w:pPr>
+                  <w:r>
+                    <w:rPr>
+                      <w:rFonts w:ascii="Avenir Next Condensed" w:cs="Avenir Next Condensed" w:eastAsia="Avenir Next Condensed" w:hAnsi="Avenir Next Condensed"/>
                       <w:b/>
                       <w:bCs/>
                       <w:i w:val="false"/>
                       <w:iCs w:val="false"/>
                       <w:sz w:val="20"/>
                       <w:szCs w:val="20"/>
+                      <w:color w:val="FFFFFF"/>
                     </w:rPr>
                     <w:t xml:space="preserve">AUDIO</w:t>
                   </w:r>
@@ -1561,28 +1584,29 @@
                 <w:tcPr>
                   <w:tcW w:type="dxa" w:w="5550"/>
                   <w:gridSpan w:val="3"/>
-                  <w:shd w:fill="EAE7DD" w:color="auto" w:val="clear"/>
-                  <w:tcMar>
-                    <w:top w:type="dxa" w:w="40"/>
-                    <w:left w:type="dxa" w:w="80"/>
-                    <w:bottom w:type="dxa" w:w="40"/>
-                    <w:right w:type="dxa" w:w="80"/>
-                  </w:tcMar>
-                  <w:vAlign w:val="top"/>
-                </w:tcPr>
-                <w:p>
-                  <w:pPr>
-                    <w:spacing w:after="0"/>
-                  </w:pPr>
-                  <w:r>
-                    <w:rPr>
-                      <w:rFonts w:ascii="Calibri" w:cs="Calibri" w:eastAsia="Times New Roman" w:hAnsi="Calibri"/>
-                      <w:b w:val="false"/>
-                      <w:bCs w:val="false"/>
-                      <w:i w:val="false"/>
-                      <w:iCs w:val="false"/>
-                      <w:sz w:val="20"/>
-                      <w:szCs w:val="20"/>
+                  <w:shd w:fill="595A5C" w:color="auto" w:val="clear"/>
+                  <w:tcMar>
+                    <w:top w:type="dxa" w:w="40"/>
+                    <w:left w:type="dxa" w:w="80"/>
+                    <w:bottom w:type="dxa" w:w="40"/>
+                    <w:right w:type="dxa" w:w="80"/>
+                  </w:tcMar>
+                  <w:vAlign w:val="top"/>
+                </w:tcPr>
+                <w:p>
+                  <w:pPr>
+                    <w:spacing w:after="0" w:line="204" w:lineRule="auto"/>
+                  </w:pPr>
+                  <w:r>
+                    <w:rPr>
+                      <w:rFonts w:ascii="Avenir Next" w:cs="Avenir Next" w:eastAsia="Avenir Next" w:hAnsi="Avenir Next"/>
+                      <w:b w:val="false"/>
+                      <w:bCs w:val="false"/>
+                      <w:i w:val="false"/>
+                      <w:iCs w:val="false"/>
+                      <w:sz w:val="20"/>
+                      <w:szCs w:val="20"/>
+                      <w:color w:val="FFFFFF"/>
                     </w:rPr>
                     <w:t xml:space="preserve"/>
                   </w:r>
@@ -1603,11 +1627,11 @@
                 </w:tcPr>
                 <w:p>
                   <w:pPr>
-                    <w:spacing w:after="0"/>
-                  </w:pPr>
-                  <w:r>
-                    <w:rPr>
-                      <w:rFonts w:ascii="Calibri" w:cs="Calibri" w:eastAsia="Times New Roman" w:hAnsi="Calibri"/>
+                    <w:spacing w:after="0" w:line="204" w:lineRule="auto"/>
+                  </w:pPr>
+                  <w:r>
+                    <w:rPr>
+                      <w:rFonts w:ascii="Avenir Next Condensed" w:cs="Avenir Next Condensed" w:eastAsia="Avenir Next Condensed" w:hAnsi="Avenir Next Condensed"/>
                       <w:b w:val="false"/>
                       <w:bCs w:val="false"/>
                       <w:i w:val="false"/>
@@ -1632,12 +1656,12 @@
                 </w:tcPr>
                 <w:p>
                   <w:pPr>
-                    <w:spacing w:after="0"/>
+                    <w:spacing w:after="0" w:line="204" w:lineRule="auto"/>
                     <w:jc w:val="center"/>
                   </w:pPr>
                   <w:r>
                     <w:rPr>
-                      <w:rFonts w:ascii="Calibri" w:cs="Calibri" w:eastAsia="Times New Roman" w:hAnsi="Calibri"/>
+                      <w:rFonts w:ascii="Avenir Next Condensed" w:cs="Avenir Next Condensed" w:eastAsia="Avenir Next Condensed" w:hAnsi="Avenir Next Condensed"/>
                       <w:b/>
                       <w:bCs/>
                       <w:i w:val="false"/>
@@ -1650,12 +1674,12 @@
                 </w:p>
                 <w:p>
                   <w:pPr>
-                    <w:spacing w:after="0"/>
+                    <w:spacing w:after="0" w:line="204" w:lineRule="auto"/>
                     <w:jc w:val="center"/>
                   </w:pPr>
                   <w:r>
                     <w:rPr>
-                      <w:rFonts w:ascii="Calibri" w:cs="Calibri" w:eastAsia="Times New Roman" w:hAnsi="Calibri"/>
+                      <w:rFonts w:ascii="Avenir Next Condensed" w:cs="Avenir Next Condensed" w:eastAsia="Avenir Next Condensed" w:hAnsi="Avenir Next Condensed"/>
                       <w:b w:val="false"/>
                       <w:bCs w:val="false"/>
                       <w:i w:val="false"/>
@@ -1680,12 +1704,12 @@
                 </w:tcPr>
                 <w:p>
                   <w:pPr>
-                    <w:spacing w:after="0"/>
+                    <w:spacing w:after="0" w:line="204" w:lineRule="auto"/>
                     <w:jc w:val="center"/>
                   </w:pPr>
                   <w:r>
                     <w:rPr>
-                      <w:rFonts w:ascii="Calibri" w:cs="Calibri" w:eastAsia="Times New Roman" w:hAnsi="Calibri"/>
+                      <w:rFonts w:ascii="Avenir Next Condensed" w:cs="Avenir Next Condensed" w:eastAsia="Avenir Next Condensed" w:hAnsi="Avenir Next Condensed"/>
                       <w:b/>
                       <w:bCs/>
                       <w:i w:val="false"/>
@@ -1698,12 +1722,12 @@
                 </w:p>
                 <w:p>
                   <w:pPr>
-                    <w:spacing w:after="0"/>
+                    <w:spacing w:after="0" w:line="204" w:lineRule="auto"/>
                     <w:jc w:val="center"/>
                   </w:pPr>
                   <w:r>
                     <w:rPr>
-                      <w:rFonts w:ascii="Calibri" w:cs="Calibri" w:eastAsia="Times New Roman" w:hAnsi="Calibri"/>
+                      <w:rFonts w:ascii="Avenir Next Condensed" w:cs="Avenir Next Condensed" w:eastAsia="Avenir Next Condensed" w:hAnsi="Avenir Next Condensed"/>
                       <w:b w:val="false"/>
                       <w:bCs w:val="false"/>
                       <w:i w:val="false"/>
@@ -1728,12 +1752,12 @@
                 </w:tcPr>
                 <w:p>
                   <w:pPr>
-                    <w:spacing w:after="0"/>
+                    <w:spacing w:after="0" w:line="204" w:lineRule="auto"/>
                     <w:jc w:val="center"/>
                   </w:pPr>
                   <w:r>
                     <w:rPr>
-                      <w:rFonts w:ascii="Calibri" w:cs="Calibri" w:eastAsia="Times New Roman" w:hAnsi="Calibri"/>
+                      <w:rFonts w:ascii="Avenir Next Condensed" w:cs="Avenir Next Condensed" w:eastAsia="Avenir Next Condensed" w:hAnsi="Avenir Next Condensed"/>
                       <w:b/>
                       <w:bCs/>
                       <w:i w:val="false"/>
@@ -1746,12 +1770,12 @@
                 </w:p>
                 <w:p>
                   <w:pPr>
-                    <w:spacing w:after="0"/>
+                    <w:spacing w:after="0" w:line="204" w:lineRule="auto"/>
                     <w:jc w:val="center"/>
                   </w:pPr>
                   <w:r>
                     <w:rPr>
-                      <w:rFonts w:ascii="Calibri" w:cs="Calibri" w:eastAsia="Times New Roman" w:hAnsi="Calibri"/>
+                      <w:rFonts w:ascii="Avenir Next Condensed" w:cs="Avenir Next Condensed" w:eastAsia="Avenir Next Condensed" w:hAnsi="Avenir Next Condensed"/>
                       <w:b w:val="false"/>
                       <w:bCs w:val="false"/>
                       <w:i w:val="false"/>
@@ -1778,12 +1802,12 @@
                 </w:tcPr>
                 <w:p>
                   <w:pPr>
-                    <w:spacing w:after="0"/>
+                    <w:spacing w:after="0" w:line="204" w:lineRule="auto"/>
                     <w:jc w:val="right"/>
                   </w:pPr>
                   <w:r>
                     <w:rPr>
-                      <w:rFonts w:ascii="Calibri" w:cs="Calibri" w:eastAsia="Times New Roman" w:hAnsi="Calibri"/>
+                      <w:rFonts w:ascii="Avenir Next Condensed" w:cs="Avenir Next Condensed" w:eastAsia="Avenir Next Condensed" w:hAnsi="Avenir Next Condensed"/>
                       <w:b/>
                       <w:bCs/>
                       <w:i w:val="false"/>
@@ -1808,11 +1832,11 @@
                 </w:tcPr>
                 <w:p>
                   <w:pPr>
-                    <w:spacing w:after="0"/>
-                  </w:pPr>
-                  <w:r>
-                    <w:rPr>
-                      <w:rFonts w:ascii="Calibri" w:cs="Calibri" w:eastAsia="Times New Roman" w:hAnsi="Calibri"/>
+                    <w:spacing w:after="0" w:line="204" w:lineRule="auto"/>
+                  </w:pPr>
+                  <w:r>
+                    <w:rPr>
+                      <w:rFonts w:ascii="Avenir Next" w:cs="Avenir Next" w:eastAsia="Avenir Next" w:hAnsi="Avenir Next"/>
                       <w:b w:val="false"/>
                       <w:bCs w:val="false"/>
                       <w:i w:val="false"/>
@@ -1837,11 +1861,11 @@
                 </w:tcPr>
                 <w:p>
                   <w:pPr>
-                    <w:spacing w:after="0"/>
-                  </w:pPr>
-                  <w:r>
-                    <w:rPr>
-                      <w:rFonts w:ascii="Calibri" w:cs="Calibri" w:eastAsia="Times New Roman" w:hAnsi="Calibri"/>
+                    <w:spacing w:after="0" w:line="204" w:lineRule="auto"/>
+                  </w:pPr>
+                  <w:r>
+                    <w:rPr>
+                      <w:rFonts w:ascii="Avenir Next" w:cs="Avenir Next" w:eastAsia="Avenir Next" w:hAnsi="Avenir Next"/>
                       <w:b w:val="false"/>
                       <w:bCs w:val="false"/>
                       <w:i w:val="false"/>
@@ -1866,11 +1890,11 @@
                 </w:tcPr>
                 <w:p>
                   <w:pPr>
-                    <w:spacing w:after="0"/>
-                  </w:pPr>
-                  <w:r>
-                    <w:rPr>
-                      <w:rFonts w:ascii="Calibri" w:cs="Calibri" w:eastAsia="Times New Roman" w:hAnsi="Calibri"/>
+                    <w:spacing w:after="0" w:line="204" w:lineRule="auto"/>
+                  </w:pPr>
+                  <w:r>
+                    <w:rPr>
+                      <w:rFonts w:ascii="Avenir Next" w:cs="Avenir Next" w:eastAsia="Avenir Next" w:hAnsi="Avenir Next"/>
                       <w:b w:val="false"/>
                       <w:bCs w:val="false"/>
                       <w:i w:val="false"/>
@@ -1897,12 +1921,12 @@
                 </w:tcPr>
                 <w:p>
                   <w:pPr>
-                    <w:spacing w:after="0"/>
+                    <w:spacing w:after="0" w:line="204" w:lineRule="auto"/>
                     <w:jc w:val="right"/>
                   </w:pPr>
                   <w:r>
                     <w:rPr>
-                      <w:rFonts w:ascii="Calibri" w:cs="Calibri" w:eastAsia="Times New Roman" w:hAnsi="Calibri"/>
+                      <w:rFonts w:ascii="Avenir Next Condensed" w:cs="Avenir Next Condensed" w:eastAsia="Avenir Next Condensed" w:hAnsi="Avenir Next Condensed"/>
                       <w:b/>
                       <w:bCs/>
                       <w:i w:val="false"/>
@@ -1927,67 +1951,67 @@
                 </w:tcPr>
                 <w:p>
                   <w:pPr>
-                    <w:spacing w:after="0"/>
-                  </w:pPr>
-                  <w:r>
-                    <w:rPr>
-                      <w:rFonts w:ascii="Calibri" w:cs="Calibri" w:eastAsia="Times New Roman" w:hAnsi="Calibri"/>
-                      <w:b w:val="false"/>
-                      <w:bCs w:val="false"/>
-                      <w:i w:val="false"/>
-                      <w:iCs w:val="false"/>
-                      <w:sz w:val="20"/>
-                      <w:szCs w:val="20"/>
-                    </w:rPr>
-                  </w:r>
-                </w:p>
-              </w:tc>
-              <w:tc>
-                <w:tcPr>
-                  <w:tcW w:type="dxa" w:w="1850"/>
-                  <w:tcMar>
-                    <w:top w:type="dxa" w:w="40"/>
-                    <w:left w:type="dxa" w:w="80"/>
-                    <w:bottom w:type="dxa" w:w="40"/>
-                    <w:right w:type="dxa" w:w="80"/>
-                  </w:tcMar>
-                  <w:vAlign w:val="top"/>
-                </w:tcPr>
-                <w:p>
-                  <w:pPr>
-                    <w:spacing w:after="0"/>
-                  </w:pPr>
-                  <w:r>
-                    <w:rPr>
-                      <w:rFonts w:ascii="Calibri" w:cs="Calibri" w:eastAsia="Times New Roman" w:hAnsi="Calibri"/>
-                      <w:b w:val="false"/>
-                      <w:bCs w:val="false"/>
-                      <w:i w:val="false"/>
-                      <w:iCs w:val="false"/>
-                      <w:sz w:val="20"/>
-                      <w:szCs w:val="20"/>
-                    </w:rPr>
-                  </w:r>
-                </w:p>
-              </w:tc>
-              <w:tc>
-                <w:tcPr>
-                  <w:tcW w:type="dxa" w:w="1850"/>
-                  <w:tcMar>
-                    <w:top w:type="dxa" w:w="40"/>
-                    <w:left w:type="dxa" w:w="80"/>
-                    <w:bottom w:type="dxa" w:w="40"/>
-                    <w:right w:type="dxa" w:w="80"/>
-                  </w:tcMar>
-                  <w:vAlign w:val="top"/>
-                </w:tcPr>
-                <w:p>
-                  <w:pPr>
-                    <w:spacing w:after="0"/>
-                  </w:pPr>
-                  <w:r>
-                    <w:rPr>
-                      <w:rFonts w:ascii="Calibri" w:cs="Calibri" w:eastAsia="Times New Roman" w:hAnsi="Calibri"/>
+                    <w:spacing w:after="0" w:line="204" w:lineRule="auto"/>
+                  </w:pPr>
+                  <w:r>
+                    <w:rPr>
+                      <w:rFonts w:ascii="Avenir Next" w:cs="Avenir Next" w:eastAsia="Avenir Next" w:hAnsi="Avenir Next"/>
+                      <w:b w:val="false"/>
+                      <w:bCs w:val="false"/>
+                      <w:i w:val="false"/>
+                      <w:iCs w:val="false"/>
+                      <w:sz w:val="20"/>
+                      <w:szCs w:val="20"/>
+                    </w:rPr>
+                  </w:r>
+                </w:p>
+              </w:tc>
+              <w:tc>
+                <w:tcPr>
+                  <w:tcW w:type="dxa" w:w="1850"/>
+                  <w:tcMar>
+                    <w:top w:type="dxa" w:w="40"/>
+                    <w:left w:type="dxa" w:w="80"/>
+                    <w:bottom w:type="dxa" w:w="40"/>
+                    <w:right w:type="dxa" w:w="80"/>
+                  </w:tcMar>
+                  <w:vAlign w:val="top"/>
+                </w:tcPr>
+                <w:p>
+                  <w:pPr>
+                    <w:spacing w:after="0" w:line="204" w:lineRule="auto"/>
+                  </w:pPr>
+                  <w:r>
+                    <w:rPr>
+                      <w:rFonts w:ascii="Avenir Next" w:cs="Avenir Next" w:eastAsia="Avenir Next" w:hAnsi="Avenir Next"/>
+                      <w:b w:val="false"/>
+                      <w:bCs w:val="false"/>
+                      <w:i w:val="false"/>
+                      <w:iCs w:val="false"/>
+                      <w:sz w:val="20"/>
+                      <w:szCs w:val="20"/>
+                    </w:rPr>
+                  </w:r>
+                </w:p>
+              </w:tc>
+              <w:tc>
+                <w:tcPr>
+                  <w:tcW w:type="dxa" w:w="1850"/>
+                  <w:tcMar>
+                    <w:top w:type="dxa" w:w="40"/>
+                    <w:left w:type="dxa" w:w="80"/>
+                    <w:bottom w:type="dxa" w:w="40"/>
+                    <w:right w:type="dxa" w:w="80"/>
+                  </w:tcMar>
+                  <w:vAlign w:val="top"/>
+                </w:tcPr>
+                <w:p>
+                  <w:pPr>
+                    <w:spacing w:after="0" w:line="204" w:lineRule="auto"/>
+                  </w:pPr>
+                  <w:r>
+                    <w:rPr>
+                      <w:rFonts w:ascii="Avenir Next" w:cs="Avenir Next" w:eastAsia="Avenir Next" w:hAnsi="Avenir Next"/>
                       <w:b w:val="false"/>
                       <w:bCs w:val="false"/>
                       <w:i w:val="false"/>
@@ -2013,12 +2037,12 @@
                 </w:tcPr>
                 <w:p>
                   <w:pPr>
-                    <w:spacing w:after="0"/>
+                    <w:spacing w:after="0" w:line="204" w:lineRule="auto"/>
                     <w:jc w:val="right"/>
                   </w:pPr>
                   <w:r>
                     <w:rPr>
-                      <w:rFonts w:ascii="Calibri" w:cs="Calibri" w:eastAsia="Times New Roman" w:hAnsi="Calibri"/>
+                      <w:rFonts w:ascii="Avenir Next Condensed" w:cs="Avenir Next Condensed" w:eastAsia="Avenir Next Condensed" w:hAnsi="Avenir Next Condensed"/>
                       <w:b/>
                       <w:bCs/>
                       <w:i w:val="false"/>
@@ -2043,11 +2067,11 @@
                 </w:tcPr>
                 <w:p>
                   <w:pPr>
-                    <w:spacing w:after="0"/>
-                  </w:pPr>
-                  <w:r>
-                    <w:rPr>
-                      <w:rFonts w:ascii="Calibri" w:cs="Calibri" w:eastAsia="Times New Roman" w:hAnsi="Calibri"/>
+                    <w:spacing w:after="0" w:line="204" w:lineRule="auto"/>
+                  </w:pPr>
+                  <w:r>
+                    <w:rPr>
+                      <w:rFonts w:ascii="Avenir Next" w:cs="Avenir Next" w:eastAsia="Avenir Next" w:hAnsi="Avenir Next"/>
                       <w:b w:val="false"/>
                       <w:bCs w:val="false"/>
                       <w:i w:val="false"/>
@@ -2072,11 +2096,11 @@
                 </w:tcPr>
                 <w:p>
                   <w:pPr>
-                    <w:spacing w:after="0"/>
-                  </w:pPr>
-                  <w:r>
-                    <w:rPr>
-                      <w:rFonts w:ascii="Calibri" w:cs="Calibri" w:eastAsia="Times New Roman" w:hAnsi="Calibri"/>
+                    <w:spacing w:after="0" w:line="204" w:lineRule="auto"/>
+                  </w:pPr>
+                  <w:r>
+                    <w:rPr>
+                      <w:rFonts w:ascii="Avenir Next" w:cs="Avenir Next" w:eastAsia="Avenir Next" w:hAnsi="Avenir Next"/>
                       <w:b w:val="false"/>
                       <w:bCs w:val="false"/>
                       <w:i w:val="false"/>
@@ -2101,11 +2125,11 @@
                 </w:tcPr>
                 <w:p>
                   <w:pPr>
-                    <w:spacing w:after="0"/>
-                  </w:pPr>
-                  <w:r>
-                    <w:rPr>
-                      <w:rFonts w:ascii="Calibri" w:cs="Calibri" w:eastAsia="Times New Roman" w:hAnsi="Calibri"/>
+                    <w:spacing w:after="0" w:line="204" w:lineRule="auto"/>
+                  </w:pPr>
+                  <w:r>
+                    <w:rPr>
+                      <w:rFonts w:ascii="Avenir Next" w:cs="Avenir Next" w:eastAsia="Avenir Next" w:hAnsi="Avenir Next"/>
                       <w:b w:val="false"/>
                       <w:bCs w:val="false"/>
                       <w:i w:val="false"/>
@@ -2132,12 +2156,12 @@
                 </w:tcPr>
                 <w:p>
                   <w:pPr>
-                    <w:spacing w:after="0"/>
+                    <w:spacing w:after="0" w:line="204" w:lineRule="auto"/>
                     <w:jc w:val="right"/>
                   </w:pPr>
                   <w:r>
                     <w:rPr>
-                      <w:rFonts w:ascii="Calibri" w:cs="Calibri" w:eastAsia="Times New Roman" w:hAnsi="Calibri"/>
+                      <w:rFonts w:ascii="Avenir Next Condensed" w:cs="Avenir Next Condensed" w:eastAsia="Avenir Next Condensed" w:hAnsi="Avenir Next Condensed"/>
                       <w:b/>
                       <w:bCs/>
                       <w:i w:val="false"/>
@@ -2162,11 +2186,11 @@
                 </w:tcPr>
                 <w:p>
                   <w:pPr>
-                    <w:spacing w:after="0"/>
-                  </w:pPr>
-                  <w:r>
-                    <w:rPr>
-                      <w:rFonts w:ascii="Calibri" w:cs="Calibri" w:eastAsia="Times New Roman" w:hAnsi="Calibri"/>
+                    <w:spacing w:after="0" w:line="204" w:lineRule="auto"/>
+                  </w:pPr>
+                  <w:r>
+                    <w:rPr>
+                      <w:rFonts w:ascii="Avenir Next" w:cs="Avenir Next" w:eastAsia="Avenir Next" w:hAnsi="Avenir Next"/>
                       <w:b w:val="false"/>
                       <w:bCs w:val="false"/>
                       <w:i w:val="false"/>
@@ -2179,11 +2203,11 @@
                 </w:p>
                 <w:p>
                   <w:pPr>
-                    <w:spacing w:after="0"/>
-                  </w:pPr>
-                  <w:r>
-                    <w:rPr>
-                      <w:rFonts w:ascii="Calibri" w:cs="Calibri" w:eastAsia="Times New Roman" w:hAnsi="Calibri"/>
+                    <w:spacing w:after="0" w:line="204" w:lineRule="auto"/>
+                  </w:pPr>
+                  <w:r>
+                    <w:rPr>
+                      <w:rFonts w:ascii="Avenir Next" w:cs="Avenir Next" w:eastAsia="Avenir Next" w:hAnsi="Avenir Next"/>
                       <w:b w:val="false"/>
                       <w:bCs w:val="false"/>
                       <w:i w:val="false"/>
@@ -2208,11 +2232,11 @@
                 </w:tcPr>
                 <w:p>
                   <w:pPr>
-                    <w:spacing w:after="0"/>
-                  </w:pPr>
-                  <w:r>
-                    <w:rPr>
-                      <w:rFonts w:ascii="Calibri" w:cs="Calibri" w:eastAsia="Times New Roman" w:hAnsi="Calibri"/>
+                    <w:spacing w:after="0" w:line="204" w:lineRule="auto"/>
+                  </w:pPr>
+                  <w:r>
+                    <w:rPr>
+                      <w:rFonts w:ascii="Avenir Next" w:cs="Avenir Next" w:eastAsia="Avenir Next" w:hAnsi="Avenir Next"/>
                       <w:b w:val="false"/>
                       <w:bCs w:val="false"/>
                       <w:i w:val="false"/>
@@ -2225,11 +2249,11 @@
                 </w:p>
                 <w:p>
                   <w:pPr>
-                    <w:spacing w:after="0"/>
-                  </w:pPr>
-                  <w:r>
-                    <w:rPr>
-                      <w:rFonts w:ascii="Calibri" w:cs="Calibri" w:eastAsia="Times New Roman" w:hAnsi="Calibri"/>
+                    <w:spacing w:after="0" w:line="204" w:lineRule="auto"/>
+                  </w:pPr>
+                  <w:r>
+                    <w:rPr>
+                      <w:rFonts w:ascii="Avenir Next" w:cs="Avenir Next" w:eastAsia="Avenir Next" w:hAnsi="Avenir Next"/>
                       <w:b w:val="false"/>
                       <w:bCs w:val="false"/>
                       <w:i w:val="false"/>
@@ -2254,11 +2278,11 @@
                 </w:tcPr>
                 <w:p>
                   <w:pPr>
-                    <w:spacing w:after="0"/>
-                  </w:pPr>
-                  <w:r>
-                    <w:rPr>
-                      <w:rFonts w:ascii="Calibri" w:cs="Calibri" w:eastAsia="Times New Roman" w:hAnsi="Calibri"/>
+                    <w:spacing w:after="0" w:line="204" w:lineRule="auto"/>
+                  </w:pPr>
+                  <w:r>
+                    <w:rPr>
+                      <w:rFonts w:ascii="Avenir Next" w:cs="Avenir Next" w:eastAsia="Avenir Next" w:hAnsi="Avenir Next"/>
                       <w:b w:val="false"/>
                       <w:bCs w:val="false"/>
                       <w:i w:val="false"/>
@@ -2271,11 +2295,11 @@
                 </w:p>
                 <w:p>
                   <w:pPr>
-                    <w:spacing w:after="0"/>
-                  </w:pPr>
-                  <w:r>
-                    <w:rPr>
-                      <w:rFonts w:ascii="Calibri" w:cs="Calibri" w:eastAsia="Times New Roman" w:hAnsi="Calibri"/>
+                    <w:spacing w:after="0" w:line="204" w:lineRule="auto"/>
+                  </w:pPr>
+                  <w:r>
+                    <w:rPr>
+                      <w:rFonts w:ascii="Avenir Next" w:cs="Avenir Next" w:eastAsia="Avenir Next" w:hAnsi="Avenir Next"/>
                       <w:b w:val="false"/>
                       <w:bCs w:val="false"/>
                       <w:i w:val="false"/>
@@ -2302,12 +2326,12 @@
                 </w:tcPr>
                 <w:p>
                   <w:pPr>
-                    <w:spacing w:after="0"/>
+                    <w:spacing w:after="0" w:line="204" w:lineRule="auto"/>
                     <w:jc w:val="right"/>
                   </w:pPr>
                   <w:r>
                     <w:rPr>
-                      <w:rFonts w:ascii="Calibri" w:cs="Calibri" w:eastAsia="Times New Roman" w:hAnsi="Calibri"/>
+                      <w:rFonts w:ascii="Avenir Next Condensed" w:cs="Avenir Next Condensed" w:eastAsia="Avenir Next Condensed" w:hAnsi="Avenir Next Condensed"/>
                       <w:b/>
                       <w:bCs/>
                       <w:i w:val="false"/>
@@ -2332,115 +2356,115 @@
                 </w:tcPr>
                 <w:p>
                   <w:pPr>
-                    <w:spacing w:after="0"/>
-                  </w:pPr>
-                  <w:r>
-                    <w:rPr>
-                      <w:rFonts w:ascii="Calibri" w:cs="Calibri" w:eastAsia="Times New Roman" w:hAnsi="Calibri"/>
-                      <w:b w:val="false"/>
-                      <w:bCs w:val="false"/>
-                      <w:i w:val="false"/>
-                      <w:iCs w:val="false"/>
-                      <w:sz w:val="20"/>
-                      <w:szCs w:val="20"/>
-                    </w:rPr>
-                  </w:r>
-                </w:p>
-                <w:p>
-                  <w:pPr>
-                    <w:spacing w:after="0"/>
-                  </w:pPr>
-                  <w:r>
-                    <w:rPr>
-                      <w:rFonts w:ascii="Calibri" w:cs="Calibri" w:eastAsia="Times New Roman" w:hAnsi="Calibri"/>
-                      <w:b w:val="false"/>
-                      <w:bCs w:val="false"/>
-                      <w:i w:val="false"/>
-                      <w:iCs w:val="false"/>
-                      <w:sz w:val="20"/>
-                      <w:szCs w:val="20"/>
-                    </w:rPr>
-                  </w:r>
-                </w:p>
-              </w:tc>
-              <w:tc>
-                <w:tcPr>
-                  <w:tcW w:type="dxa" w:w="1850"/>
-                  <w:tcMar>
-                    <w:top w:type="dxa" w:w="40"/>
-                    <w:left w:type="dxa" w:w="80"/>
-                    <w:bottom w:type="dxa" w:w="40"/>
-                    <w:right w:type="dxa" w:w="80"/>
-                  </w:tcMar>
-                  <w:vAlign w:val="top"/>
-                </w:tcPr>
-                <w:p>
-                  <w:pPr>
-                    <w:spacing w:after="0"/>
-                  </w:pPr>
-                  <w:r>
-                    <w:rPr>
-                      <w:rFonts w:ascii="Calibri" w:cs="Calibri" w:eastAsia="Times New Roman" w:hAnsi="Calibri"/>
-                      <w:b w:val="false"/>
-                      <w:bCs w:val="false"/>
-                      <w:i w:val="false"/>
-                      <w:iCs w:val="false"/>
-                      <w:sz w:val="20"/>
-                      <w:szCs w:val="20"/>
-                    </w:rPr>
-                  </w:r>
-                </w:p>
-                <w:p>
-                  <w:pPr>
-                    <w:spacing w:after="0"/>
-                  </w:pPr>
-                  <w:r>
-                    <w:rPr>
-                      <w:rFonts w:ascii="Calibri" w:cs="Calibri" w:eastAsia="Times New Roman" w:hAnsi="Calibri"/>
-                      <w:b w:val="false"/>
-                      <w:bCs w:val="false"/>
-                      <w:i w:val="false"/>
-                      <w:iCs w:val="false"/>
-                      <w:sz w:val="20"/>
-                      <w:szCs w:val="20"/>
-                    </w:rPr>
-                  </w:r>
-                </w:p>
-              </w:tc>
-              <w:tc>
-                <w:tcPr>
-                  <w:tcW w:type="dxa" w:w="1850"/>
-                  <w:tcMar>
-                    <w:top w:type="dxa" w:w="40"/>
-                    <w:left w:type="dxa" w:w="80"/>
-                    <w:bottom w:type="dxa" w:w="40"/>
-                    <w:right w:type="dxa" w:w="80"/>
-                  </w:tcMar>
-                  <w:vAlign w:val="top"/>
-                </w:tcPr>
-                <w:p>
-                  <w:pPr>
-                    <w:spacing w:after="0"/>
-                  </w:pPr>
-                  <w:r>
-                    <w:rPr>
-                      <w:rFonts w:ascii="Calibri" w:cs="Calibri" w:eastAsia="Times New Roman" w:hAnsi="Calibri"/>
-                      <w:b w:val="false"/>
-                      <w:bCs w:val="false"/>
-                      <w:i w:val="false"/>
-                      <w:iCs w:val="false"/>
-                      <w:sz w:val="20"/>
-                      <w:szCs w:val="20"/>
-                    </w:rPr>
-                  </w:r>
-                </w:p>
-                <w:p>
-                  <w:pPr>
-                    <w:spacing w:after="0"/>
-                  </w:pPr>
-                  <w:r>
-                    <w:rPr>
-                      <w:rFonts w:ascii="Calibri" w:cs="Calibri" w:eastAsia="Times New Roman" w:hAnsi="Calibri"/>
+                    <w:spacing w:after="0" w:line="204" w:lineRule="auto"/>
+                  </w:pPr>
+                  <w:r>
+                    <w:rPr>
+                      <w:rFonts w:ascii="Avenir Next" w:cs="Avenir Next" w:eastAsia="Avenir Next" w:hAnsi="Avenir Next"/>
+                      <w:b w:val="false"/>
+                      <w:bCs w:val="false"/>
+                      <w:i w:val="false"/>
+                      <w:iCs w:val="false"/>
+                      <w:sz w:val="20"/>
+                      <w:szCs w:val="20"/>
+                    </w:rPr>
+                  </w:r>
+                </w:p>
+                <w:p>
+                  <w:pPr>
+                    <w:spacing w:after="0" w:line="204" w:lineRule="auto"/>
+                  </w:pPr>
+                  <w:r>
+                    <w:rPr>
+                      <w:rFonts w:ascii="Avenir Next" w:cs="Avenir Next" w:eastAsia="Avenir Next" w:hAnsi="Avenir Next"/>
+                      <w:b w:val="false"/>
+                      <w:bCs w:val="false"/>
+                      <w:i w:val="false"/>
+                      <w:iCs w:val="false"/>
+                      <w:sz w:val="20"/>
+                      <w:szCs w:val="20"/>
+                    </w:rPr>
+                  </w:r>
+                </w:p>
+              </w:tc>
+              <w:tc>
+                <w:tcPr>
+                  <w:tcW w:type="dxa" w:w="1850"/>
+                  <w:tcMar>
+                    <w:top w:type="dxa" w:w="40"/>
+                    <w:left w:type="dxa" w:w="80"/>
+                    <w:bottom w:type="dxa" w:w="40"/>
+                    <w:right w:type="dxa" w:w="80"/>
+                  </w:tcMar>
+                  <w:vAlign w:val="top"/>
+                </w:tcPr>
+                <w:p>
+                  <w:pPr>
+                    <w:spacing w:after="0" w:line="204" w:lineRule="auto"/>
+                  </w:pPr>
+                  <w:r>
+                    <w:rPr>
+                      <w:rFonts w:ascii="Avenir Next" w:cs="Avenir Next" w:eastAsia="Avenir Next" w:hAnsi="Avenir Next"/>
+                      <w:b w:val="false"/>
+                      <w:bCs w:val="false"/>
+                      <w:i w:val="false"/>
+                      <w:iCs w:val="false"/>
+                      <w:sz w:val="20"/>
+                      <w:szCs w:val="20"/>
+                    </w:rPr>
+                  </w:r>
+                </w:p>
+                <w:p>
+                  <w:pPr>
+                    <w:spacing w:after="0" w:line="204" w:lineRule="auto"/>
+                  </w:pPr>
+                  <w:r>
+                    <w:rPr>
+                      <w:rFonts w:ascii="Avenir Next" w:cs="Avenir Next" w:eastAsia="Avenir Next" w:hAnsi="Avenir Next"/>
+                      <w:b w:val="false"/>
+                      <w:bCs w:val="false"/>
+                      <w:i w:val="false"/>
+                      <w:iCs w:val="false"/>
+                      <w:sz w:val="20"/>
+                      <w:szCs w:val="20"/>
+                    </w:rPr>
+                  </w:r>
+                </w:p>
+              </w:tc>
+              <w:tc>
+                <w:tcPr>
+                  <w:tcW w:type="dxa" w:w="1850"/>
+                  <w:tcMar>
+                    <w:top w:type="dxa" w:w="40"/>
+                    <w:left w:type="dxa" w:w="80"/>
+                    <w:bottom w:type="dxa" w:w="40"/>
+                    <w:right w:type="dxa" w:w="80"/>
+                  </w:tcMar>
+                  <w:vAlign w:val="top"/>
+                </w:tcPr>
+                <w:p>
+                  <w:pPr>
+                    <w:spacing w:after="0" w:line="204" w:lineRule="auto"/>
+                  </w:pPr>
+                  <w:r>
+                    <w:rPr>
+                      <w:rFonts w:ascii="Avenir Next" w:cs="Avenir Next" w:eastAsia="Avenir Next" w:hAnsi="Avenir Next"/>
+                      <w:b w:val="false"/>
+                      <w:bCs w:val="false"/>
+                      <w:i w:val="false"/>
+                      <w:iCs w:val="false"/>
+                      <w:sz w:val="20"/>
+                      <w:szCs w:val="20"/>
+                    </w:rPr>
+                  </w:r>
+                </w:p>
+                <w:p>
+                  <w:pPr>
+                    <w:spacing w:after="0" w:line="204" w:lineRule="auto"/>
+                  </w:pPr>
+                  <w:r>
+                    <w:rPr>
+                      <w:rFonts w:ascii="Avenir Next" w:cs="Avenir Next" w:eastAsia="Avenir Next" w:hAnsi="Avenir Next"/>
                       <w:b w:val="false"/>
                       <w:bCs w:val="false"/>
                       <w:i w:val="false"/>
@@ -2466,12 +2490,12 @@
                 </w:tcPr>
                 <w:p>
                   <w:pPr>
-                    <w:spacing w:after="0"/>
+                    <w:spacing w:after="0" w:line="204" w:lineRule="auto"/>
                     <w:jc w:val="right"/>
                   </w:pPr>
                   <w:r>
                     <w:rPr>
-                      <w:rFonts w:ascii="Calibri" w:cs="Calibri" w:eastAsia="Times New Roman" w:hAnsi="Calibri"/>
+                      <w:rFonts w:ascii="Avenir Next Condensed" w:cs="Avenir Next Condensed" w:eastAsia="Avenir Next Condensed" w:hAnsi="Avenir Next Condensed"/>
                       <w:b/>
                       <w:bCs/>
                       <w:i w:val="false"/>
@@ -2496,11 +2520,11 @@
                 </w:tcPr>
                 <w:p>
                   <w:pPr>
-                    <w:spacing w:after="0"/>
-                  </w:pPr>
-                  <w:r>
-                    <w:rPr>
-                      <w:rFonts w:ascii="Calibri" w:cs="Calibri" w:eastAsia="Times New Roman" w:hAnsi="Calibri"/>
+                    <w:spacing w:after="0" w:line="204" w:lineRule="auto"/>
+                  </w:pPr>
+                  <w:r>
+                    <w:rPr>
+                      <w:rFonts w:ascii="Avenir Next" w:cs="Avenir Next" w:eastAsia="Avenir Next" w:hAnsi="Avenir Next"/>
                       <w:b w:val="false"/>
                       <w:bCs w:val="false"/>
                       <w:i w:val="false"/>
@@ -2525,11 +2549,11 @@
                 </w:tcPr>
                 <w:p>
                   <w:pPr>
-                    <w:spacing w:after="0"/>
-                  </w:pPr>
-                  <w:r>
-                    <w:rPr>
-                      <w:rFonts w:ascii="Calibri" w:cs="Calibri" w:eastAsia="Times New Roman" w:hAnsi="Calibri"/>
+                    <w:spacing w:after="0" w:line="204" w:lineRule="auto"/>
+                  </w:pPr>
+                  <w:r>
+                    <w:rPr>
+                      <w:rFonts w:ascii="Avenir Next" w:cs="Avenir Next" w:eastAsia="Avenir Next" w:hAnsi="Avenir Next"/>
                       <w:b w:val="false"/>
                       <w:bCs w:val="false"/>
                       <w:i w:val="false"/>
@@ -2554,11 +2578,11 @@
                 </w:tcPr>
                 <w:p>
                   <w:pPr>
-                    <w:spacing w:after="0"/>
-                  </w:pPr>
-                  <w:r>
-                    <w:rPr>
-                      <w:rFonts w:ascii="Calibri" w:cs="Calibri" w:eastAsia="Times New Roman" w:hAnsi="Calibri"/>
+                    <w:spacing w:after="0" w:line="204" w:lineRule="auto"/>
+                  </w:pPr>
+                  <w:r>
+                    <w:rPr>
+                      <w:rFonts w:ascii="Avenir Next" w:cs="Avenir Next" w:eastAsia="Avenir Next" w:hAnsi="Avenir Next"/>
                       <w:b w:val="false"/>
                       <w:bCs w:val="false"/>
                       <w:i w:val="false"/>
@@ -2585,12 +2609,12 @@
                 </w:tcPr>
                 <w:p>
                   <w:pPr>
-                    <w:spacing w:after="0"/>
+                    <w:spacing w:after="0" w:line="204" w:lineRule="auto"/>
                     <w:jc w:val="right"/>
                   </w:pPr>
                   <w:r>
                     <w:rPr>
-                      <w:rFonts w:ascii="Calibri" w:cs="Calibri" w:eastAsia="Times New Roman" w:hAnsi="Calibri"/>
+                      <w:rFonts w:ascii="Avenir Next Condensed" w:cs="Avenir Next Condensed" w:eastAsia="Avenir Next Condensed" w:hAnsi="Avenir Next Condensed"/>
                       <w:b/>
                       <w:bCs/>
                       <w:i w:val="false"/>
@@ -2615,7 +2639,7 @@
                 </w:tcPr>
                 <w:p>
                   <w:pPr>
-                    <w:spacing w:after="0"/>
+                    <w:spacing w:after="0" w:line="204" w:lineRule="auto"/>
                   </w:pPr>
                   <w:sdt>
                     <w:sdtPr>
@@ -2629,13 +2653,16 @@
                     <w:sdtEndPr/>
                     <w:sdtContent>
                       <w:r>
+                        <w:rPr>
+                          <w:rFonts w:ascii="Avenir Next" w:hAnsi="Avenir Next" w:cs="Avenir Next" w:eastAsia="Avenir Next"/>
+                        </w:rPr>
                         <w:t>☐</w:t>
                       </w:r>
                     </w:sdtContent>
                   </w:sdt>
                   <w:r>
                     <w:rPr>
-                      <w:rFonts w:ascii="Calibri" w:hAnsi="Calibri" w:cs="Calibri"/>
+                      <w:rFonts w:ascii="Avenir Next" w:hAnsi="Avenir Next" w:cs="Avenir Next" w:eastAsia="Avenir Next"/>
                     </w:rPr>
                     <w:t xml:space="preserve"> Yes     </w:t>
                   </w:r>
@@ -2651,13 +2678,16 @@
                     <w:sdtEndPr/>
                     <w:sdtContent>
                       <w:r>
+                        <w:rPr>
+                          <w:rFonts w:ascii="Avenir Next" w:hAnsi="Avenir Next" w:cs="Avenir Next" w:eastAsia="Avenir Next"/>
+                        </w:rPr>
                         <w:t>☐</w:t>
                       </w:r>
                     </w:sdtContent>
                   </w:sdt>
                   <w:r>
                     <w:rPr>
-                      <w:rFonts w:ascii="Calibri" w:hAnsi="Calibri" w:cs="Calibri"/>
+                      <w:rFonts w:ascii="Avenir Next" w:hAnsi="Avenir Next" w:cs="Avenir Next" w:eastAsia="Avenir Next"/>
                     </w:rPr>
                     <w:t xml:space="preserve"> No</w:t>
                   </w:r>
@@ -2676,7 +2706,7 @@
                 </w:tcPr>
                 <w:p>
                   <w:pPr>
-                    <w:spacing w:after="0"/>
+                    <w:spacing w:after="0" w:line="204" w:lineRule="auto"/>
                   </w:pPr>
                   <w:sdt>
                     <w:sdtPr>
@@ -2690,13 +2720,16 @@
                     <w:sdtEndPr/>
                     <w:sdtContent>
                       <w:r>
+                        <w:rPr>
+                          <w:rFonts w:ascii="Avenir Next" w:hAnsi="Avenir Next" w:cs="Avenir Next" w:eastAsia="Avenir Next"/>
+                        </w:rPr>
                         <w:t>☐</w:t>
                       </w:r>
                     </w:sdtContent>
                   </w:sdt>
                   <w:r>
                     <w:rPr>
-                      <w:rFonts w:ascii="Calibri" w:hAnsi="Calibri" w:cs="Calibri"/>
+                      <w:rFonts w:ascii="Avenir Next" w:hAnsi="Avenir Next" w:cs="Avenir Next" w:eastAsia="Avenir Next"/>
                     </w:rPr>
                     <w:t xml:space="preserve"> Yes     </w:t>
                   </w:r>
@@ -2712,13 +2745,16 @@
                     <w:sdtEndPr/>
                     <w:sdtContent>
                       <w:r>
+                        <w:rPr>
+                          <w:rFonts w:ascii="Avenir Next" w:hAnsi="Avenir Next" w:cs="Avenir Next" w:eastAsia="Avenir Next"/>
+                        </w:rPr>
                         <w:t>☐</w:t>
                       </w:r>
                     </w:sdtContent>
                   </w:sdt>
                   <w:r>
                     <w:rPr>
-                      <w:rFonts w:ascii="Calibri" w:hAnsi="Calibri" w:cs="Calibri"/>
+                      <w:rFonts w:ascii="Avenir Next" w:hAnsi="Avenir Next" w:cs="Avenir Next" w:eastAsia="Avenir Next"/>
                     </w:rPr>
                     <w:t xml:space="preserve"> No</w:t>
                   </w:r>
@@ -2737,7 +2773,7 @@
                 </w:tcPr>
                 <w:p>
                   <w:pPr>
-                    <w:spacing w:after="0"/>
+                    <w:spacing w:after="0" w:line="204" w:lineRule="auto"/>
                   </w:pPr>
                   <w:sdt>
                     <w:sdtPr>
@@ -2751,13 +2787,16 @@
                     <w:sdtEndPr/>
                     <w:sdtContent>
                       <w:r>
+                        <w:rPr>
+                          <w:rFonts w:ascii="Avenir Next" w:hAnsi="Avenir Next" w:cs="Avenir Next" w:eastAsia="Avenir Next"/>
+                        </w:rPr>
                         <w:t>☐</w:t>
                       </w:r>
                     </w:sdtContent>
                   </w:sdt>
                   <w:r>
                     <w:rPr>
-                      <w:rFonts w:ascii="Calibri" w:hAnsi="Calibri" w:cs="Calibri"/>
+                      <w:rFonts w:ascii="Avenir Next" w:hAnsi="Avenir Next" w:cs="Avenir Next" w:eastAsia="Avenir Next"/>
                     </w:rPr>
                     <w:t xml:space="preserve"> Yes     </w:t>
                   </w:r>
@@ -2773,13 +2812,16 @@
                     <w:sdtEndPr/>
                     <w:sdtContent>
                       <w:r>
+                        <w:rPr>
+                          <w:rFonts w:ascii="Avenir Next" w:hAnsi="Avenir Next" w:cs="Avenir Next" w:eastAsia="Avenir Next"/>
+                        </w:rPr>
                         <w:t>☐</w:t>
                       </w:r>
                     </w:sdtContent>
                   </w:sdt>
                   <w:r>
                     <w:rPr>
-                      <w:rFonts w:ascii="Calibri" w:hAnsi="Calibri" w:cs="Calibri"/>
+                      <w:rFonts w:ascii="Avenir Next" w:hAnsi="Avenir Next" w:cs="Avenir Next" w:eastAsia="Avenir Next"/>
                     </w:rPr>
                     <w:t xml:space="preserve"> No</w:t>
                   </w:r>
@@ -2800,12 +2842,12 @@
                 </w:tcPr>
                 <w:p>
                   <w:pPr>
-                    <w:spacing w:after="0"/>
+                    <w:spacing w:after="0" w:line="204" w:lineRule="auto"/>
                     <w:jc w:val="right"/>
                   </w:pPr>
                   <w:r>
                     <w:rPr>
-                      <w:rFonts w:ascii="Calibri" w:cs="Calibri" w:eastAsia="Times New Roman" w:hAnsi="Calibri"/>
+                      <w:rFonts w:ascii="Avenir Next Condensed" w:cs="Avenir Next Condensed" w:eastAsia="Avenir Next Condensed" w:hAnsi="Avenir Next Condensed"/>
                       <w:b/>
                       <w:bCs/>
                       <w:i w:val="false"/>
@@ -2830,67 +2872,67 @@
                 </w:tcPr>
                 <w:p>
                   <w:pPr>
-                    <w:spacing w:after="0"/>
-                  </w:pPr>
-                  <w:r>
-                    <w:rPr>
-                      <w:rFonts w:ascii="Calibri" w:cs="Calibri" w:eastAsia="Times New Roman" w:hAnsi="Calibri"/>
-                      <w:b w:val="false"/>
-                      <w:bCs w:val="false"/>
-                      <w:i w:val="false"/>
-                      <w:iCs w:val="false"/>
-                      <w:sz w:val="20"/>
-                      <w:szCs w:val="20"/>
-                    </w:rPr>
-                  </w:r>
-                </w:p>
-              </w:tc>
-              <w:tc>
-                <w:tcPr>
-                  <w:tcW w:type="dxa" w:w="1850"/>
-                  <w:tcMar>
-                    <w:top w:type="dxa" w:w="40"/>
-                    <w:left w:type="dxa" w:w="80"/>
-                    <w:bottom w:type="dxa" w:w="40"/>
-                    <w:right w:type="dxa" w:w="80"/>
-                  </w:tcMar>
-                  <w:vAlign w:val="top"/>
-                </w:tcPr>
-                <w:p>
-                  <w:pPr>
-                    <w:spacing w:after="0"/>
-                  </w:pPr>
-                  <w:r>
-                    <w:rPr>
-                      <w:rFonts w:ascii="Calibri" w:cs="Calibri" w:eastAsia="Times New Roman" w:hAnsi="Calibri"/>
-                      <w:b w:val="false"/>
-                      <w:bCs w:val="false"/>
-                      <w:i w:val="false"/>
-                      <w:iCs w:val="false"/>
-                      <w:sz w:val="20"/>
-                      <w:szCs w:val="20"/>
-                    </w:rPr>
-                  </w:r>
-                </w:p>
-              </w:tc>
-              <w:tc>
-                <w:tcPr>
-                  <w:tcW w:type="dxa" w:w="1850"/>
-                  <w:tcMar>
-                    <w:top w:type="dxa" w:w="40"/>
-                    <w:left w:type="dxa" w:w="80"/>
-                    <w:bottom w:type="dxa" w:w="40"/>
-                    <w:right w:type="dxa" w:w="80"/>
-                  </w:tcMar>
-                  <w:vAlign w:val="top"/>
-                </w:tcPr>
-                <w:p>
-                  <w:pPr>
-                    <w:spacing w:after="0"/>
-                  </w:pPr>
-                  <w:r>
-                    <w:rPr>
-                      <w:rFonts w:ascii="Calibri" w:cs="Calibri" w:eastAsia="Times New Roman" w:hAnsi="Calibri"/>
+                    <w:spacing w:after="0" w:line="204" w:lineRule="auto"/>
+                  </w:pPr>
+                  <w:r>
+                    <w:rPr>
+                      <w:rFonts w:ascii="Avenir Next" w:cs="Avenir Next" w:eastAsia="Avenir Next" w:hAnsi="Avenir Next"/>
+                      <w:b w:val="false"/>
+                      <w:bCs w:val="false"/>
+                      <w:i w:val="false"/>
+                      <w:iCs w:val="false"/>
+                      <w:sz w:val="20"/>
+                      <w:szCs w:val="20"/>
+                    </w:rPr>
+                  </w:r>
+                </w:p>
+              </w:tc>
+              <w:tc>
+                <w:tcPr>
+                  <w:tcW w:type="dxa" w:w="1850"/>
+                  <w:tcMar>
+                    <w:top w:type="dxa" w:w="40"/>
+                    <w:left w:type="dxa" w:w="80"/>
+                    <w:bottom w:type="dxa" w:w="40"/>
+                    <w:right w:type="dxa" w:w="80"/>
+                  </w:tcMar>
+                  <w:vAlign w:val="top"/>
+                </w:tcPr>
+                <w:p>
+                  <w:pPr>
+                    <w:spacing w:after="0" w:line="204" w:lineRule="auto"/>
+                  </w:pPr>
+                  <w:r>
+                    <w:rPr>
+                      <w:rFonts w:ascii="Avenir Next" w:cs="Avenir Next" w:eastAsia="Avenir Next" w:hAnsi="Avenir Next"/>
+                      <w:b w:val="false"/>
+                      <w:bCs w:val="false"/>
+                      <w:i w:val="false"/>
+                      <w:iCs w:val="false"/>
+                      <w:sz w:val="20"/>
+                      <w:szCs w:val="20"/>
+                    </w:rPr>
+                  </w:r>
+                </w:p>
+              </w:tc>
+              <w:tc>
+                <w:tcPr>
+                  <w:tcW w:type="dxa" w:w="1850"/>
+                  <w:tcMar>
+                    <w:top w:type="dxa" w:w="40"/>
+                    <w:left w:type="dxa" w:w="80"/>
+                    <w:bottom w:type="dxa" w:w="40"/>
+                    <w:right w:type="dxa" w:w="80"/>
+                  </w:tcMar>
+                  <w:vAlign w:val="top"/>
+                </w:tcPr>
+                <w:p>
+                  <w:pPr>
+                    <w:spacing w:after="0" w:line="204" w:lineRule="auto"/>
+                  </w:pPr>
+                  <w:r>
+                    <w:rPr>
+                      <w:rFonts w:ascii="Avenir Next" w:cs="Avenir Next" w:eastAsia="Avenir Next" w:hAnsi="Avenir Next"/>
                       <w:b w:val="false"/>
                       <w:bCs w:val="false"/>
                       <w:i w:val="false"/>
@@ -2916,12 +2958,12 @@
                 </w:tcPr>
                 <w:p>
                   <w:pPr>
-                    <w:spacing w:after="0"/>
+                    <w:spacing w:after="0" w:line="204" w:lineRule="auto"/>
                     <w:jc w:val="right"/>
                   </w:pPr>
                   <w:r>
                     <w:rPr>
-                      <w:rFonts w:ascii="Calibri" w:cs="Calibri" w:eastAsia="Times New Roman" w:hAnsi="Calibri"/>
+                      <w:rFonts w:ascii="Avenir Next Condensed" w:cs="Avenir Next Condensed" w:eastAsia="Avenir Next Condensed" w:hAnsi="Avenir Next Condensed"/>
                       <w:b/>
                       <w:bCs/>
                       <w:i w:val="false"/>
@@ -2946,11 +2988,11 @@
                 </w:tcPr>
                 <w:p>
                   <w:pPr>
-                    <w:spacing w:after="0"/>
-                  </w:pPr>
-                  <w:r>
-                    <w:rPr>
-                      <w:rFonts w:ascii="Calibri" w:cs="Calibri" w:eastAsia="Times New Roman" w:hAnsi="Calibri"/>
+                    <w:spacing w:after="0" w:line="204" w:lineRule="auto"/>
+                  </w:pPr>
+                  <w:r>
+                    <w:rPr>
+                      <w:rFonts w:ascii="Avenir Next" w:cs="Avenir Next" w:eastAsia="Avenir Next" w:hAnsi="Avenir Next"/>
                       <w:b w:val="false"/>
                       <w:bCs w:val="false"/>
                       <w:i w:val="false"/>
@@ -2975,11 +3017,11 @@
                 </w:tcPr>
                 <w:p>
                   <w:pPr>
-                    <w:spacing w:after="0"/>
-                  </w:pPr>
-                  <w:r>
-                    <w:rPr>
-                      <w:rFonts w:ascii="Calibri" w:cs="Calibri" w:eastAsia="Times New Roman" w:hAnsi="Calibri"/>
+                    <w:spacing w:after="0" w:line="204" w:lineRule="auto"/>
+                  </w:pPr>
+                  <w:r>
+                    <w:rPr>
+                      <w:rFonts w:ascii="Avenir Next" w:cs="Avenir Next" w:eastAsia="Avenir Next" w:hAnsi="Avenir Next"/>
                       <w:b w:val="false"/>
                       <w:bCs w:val="false"/>
                       <w:i w:val="false"/>
@@ -3004,11 +3046,11 @@
                 </w:tcPr>
                 <w:p>
                   <w:pPr>
-                    <w:spacing w:after="0"/>
-                  </w:pPr>
-                  <w:r>
-                    <w:rPr>
-                      <w:rFonts w:ascii="Calibri" w:cs="Calibri" w:eastAsia="Times New Roman" w:hAnsi="Calibri"/>
+                    <w:spacing w:after="0" w:line="204" w:lineRule="auto"/>
+                  </w:pPr>
+                  <w:r>
+                    <w:rPr>
+                      <w:rFonts w:ascii="Avenir Next" w:cs="Avenir Next" w:eastAsia="Avenir Next" w:hAnsi="Avenir Next"/>
                       <w:b w:val="false"/>
                       <w:bCs w:val="false"/>
                       <w:i w:val="false"/>
@@ -3035,12 +3077,12 @@
                 </w:tcPr>
                 <w:p>
                   <w:pPr>
-                    <w:spacing w:after="0"/>
+                    <w:spacing w:after="0" w:line="204" w:lineRule="auto"/>
                     <w:jc w:val="right"/>
                   </w:pPr>
                   <w:r>
                     <w:rPr>
-                      <w:rFonts w:ascii="Calibri" w:cs="Calibri" w:eastAsia="Times New Roman" w:hAnsi="Calibri"/>
+                      <w:rFonts w:ascii="Avenir Next Condensed" w:cs="Avenir Next Condensed" w:eastAsia="Avenir Next Condensed" w:hAnsi="Avenir Next Condensed"/>
                       <w:b/>
                       <w:bCs/>
                       <w:i w:val="false"/>
@@ -3065,11 +3107,11 @@
                 </w:tcPr>
                 <w:p>
                   <w:pPr>
-                    <w:spacing w:after="0"/>
-                  </w:pPr>
-                  <w:r>
-                    <w:rPr>
-                      <w:rFonts w:ascii="Calibri" w:cs="Calibri" w:eastAsia="Times New Roman" w:hAnsi="Calibri"/>
+                    <w:spacing w:after="0" w:line="204" w:lineRule="auto"/>
+                  </w:pPr>
+                  <w:r>
+                    <w:rPr>
+                      <w:rFonts w:ascii="Avenir Next" w:cs="Avenir Next" w:eastAsia="Avenir Next" w:hAnsi="Avenir Next"/>
                       <w:b w:val="false"/>
                       <w:bCs w:val="false"/>
                       <w:i w:val="false"/>
@@ -3094,11 +3136,11 @@
                 </w:tcPr>
                 <w:p>
                   <w:pPr>
-                    <w:spacing w:after="0"/>
-                  </w:pPr>
-                  <w:r>
-                    <w:rPr>
-                      <w:rFonts w:ascii="Calibri" w:cs="Calibri" w:eastAsia="Times New Roman" w:hAnsi="Calibri"/>
+                    <w:spacing w:after="0" w:line="204" w:lineRule="auto"/>
+                  </w:pPr>
+                  <w:r>
+                    <w:rPr>
+                      <w:rFonts w:ascii="Avenir Next" w:cs="Avenir Next" w:eastAsia="Avenir Next" w:hAnsi="Avenir Next"/>
                       <w:b w:val="false"/>
                       <w:bCs w:val="false"/>
                       <w:i w:val="false"/>
@@ -3123,11 +3165,11 @@
                 </w:tcPr>
                 <w:p>
                   <w:pPr>
-                    <w:spacing w:after="0"/>
-                  </w:pPr>
-                  <w:r>
-                    <w:rPr>
-                      <w:rFonts w:ascii="Calibri" w:cs="Calibri" w:eastAsia="Times New Roman" w:hAnsi="Calibri"/>
+                    <w:spacing w:after="0" w:line="204" w:lineRule="auto"/>
+                  </w:pPr>
+                  <w:r>
+                    <w:rPr>
+                      <w:rFonts w:ascii="Avenir Next" w:cs="Avenir Next" w:eastAsia="Avenir Next" w:hAnsi="Avenir Next"/>
                       <w:b w:val="false"/>
                       <w:bCs w:val="false"/>
                       <w:i w:val="false"/>
@@ -3154,12 +3196,12 @@
                 </w:tcPr>
                 <w:p>
                   <w:pPr>
-                    <w:spacing w:after="0"/>
+                    <w:spacing w:after="0" w:line="204" w:lineRule="auto"/>
                     <w:jc w:val="right"/>
                   </w:pPr>
                   <w:r>
                     <w:rPr>
-                      <w:rFonts w:ascii="Calibri" w:cs="Calibri" w:eastAsia="Times New Roman" w:hAnsi="Calibri"/>
+                      <w:rFonts w:ascii="Avenir Next Condensed" w:cs="Avenir Next Condensed" w:eastAsia="Avenir Next Condensed" w:hAnsi="Avenir Next Condensed"/>
                       <w:b/>
                       <w:bCs/>
                       <w:i w:val="false"/>
@@ -3184,7 +3226,7 @@
                 </w:tcPr>
                 <w:p>
                   <w:pPr>
-                    <w:spacing w:after="0"/>
+                    <w:spacing w:after="0" w:line="204" w:lineRule="auto"/>
                   </w:pPr>
                   <w:sdt>
                     <w:sdtPr>
@@ -3198,13 +3240,16 @@
                     <w:sdtEndPr/>
                     <w:sdtContent>
                       <w:r>
+                        <w:rPr>
+                          <w:rFonts w:ascii="Avenir Next" w:hAnsi="Avenir Next" w:cs="Avenir Next" w:eastAsia="Avenir Next"/>
+                        </w:rPr>
                         <w:t>☐</w:t>
                       </w:r>
                     </w:sdtContent>
                   </w:sdt>
                   <w:r>
                     <w:rPr>
-                      <w:rFonts w:ascii="Calibri" w:cs="Calibri" w:eastAsia="Times New Roman" w:hAnsi="Calibri"/>
+                      <w:rFonts w:ascii="Avenir Next" w:cs="Avenir Next" w:eastAsia="Avenir Next" w:hAnsi="Avenir Next"/>
                       <w:b w:val="false"/>
                       <w:bCs w:val="false"/>
                       <w:i w:val="false"/>
@@ -3226,13 +3271,16 @@
                     <w:sdtEndPr/>
                     <w:sdtContent>
                       <w:r>
+                        <w:rPr>
+                          <w:rFonts w:ascii="Avenir Next" w:hAnsi="Avenir Next" w:cs="Avenir Next" w:eastAsia="Avenir Next"/>
+                        </w:rPr>
                         <w:t>☐</w:t>
                       </w:r>
                     </w:sdtContent>
                   </w:sdt>
                   <w:r>
                     <w:rPr>
-                      <w:rFonts w:ascii="Calibri" w:cs="Calibri" w:eastAsia="Times New Roman" w:hAnsi="Calibri"/>
+                      <w:rFonts w:ascii="Avenir Next" w:cs="Avenir Next" w:eastAsia="Avenir Next" w:hAnsi="Avenir Next"/>
                       <w:b w:val="false"/>
                       <w:bCs w:val="false"/>
                       <w:i w:val="false"/>
@@ -3257,7 +3305,7 @@
                 </w:tcPr>
                 <w:p>
                   <w:pPr>
-                    <w:spacing w:after="0"/>
+                    <w:spacing w:after="0" w:line="204" w:lineRule="auto"/>
                   </w:pPr>
                   <w:sdt>
                     <w:sdtPr>
@@ -3271,13 +3319,16 @@
                     <w:sdtEndPr/>
                     <w:sdtContent>
                       <w:r>
+                        <w:rPr>
+                          <w:rFonts w:ascii="Avenir Next" w:hAnsi="Avenir Next" w:cs="Avenir Next" w:eastAsia="Avenir Next"/>
+                        </w:rPr>
                         <w:t>☐</w:t>
                       </w:r>
                     </w:sdtContent>
                   </w:sdt>
                   <w:r>
                     <w:rPr>
-                      <w:rFonts w:ascii="Calibri" w:cs="Calibri" w:eastAsia="Times New Roman" w:hAnsi="Calibri"/>
+                      <w:rFonts w:ascii="Avenir Next" w:cs="Avenir Next" w:eastAsia="Avenir Next" w:hAnsi="Avenir Next"/>
                       <w:b w:val="false"/>
                       <w:bCs w:val="false"/>
                       <w:i w:val="false"/>
@@ -3299,13 +3350,16 @@
                     <w:sdtEndPr/>
                     <w:sdtContent>
                       <w:r>
+                        <w:rPr>
+                          <w:rFonts w:ascii="Avenir Next" w:hAnsi="Avenir Next" w:cs="Avenir Next" w:eastAsia="Avenir Next"/>
+                        </w:rPr>
                         <w:t>☐</w:t>
                       </w:r>
                     </w:sdtContent>
                   </w:sdt>
                   <w:r>
                     <w:rPr>
-                      <w:rFonts w:ascii="Calibri" w:cs="Calibri" w:eastAsia="Times New Roman" w:hAnsi="Calibri"/>
+                      <w:rFonts w:ascii="Avenir Next" w:cs="Avenir Next" w:eastAsia="Avenir Next" w:hAnsi="Avenir Next"/>
                       <w:b w:val="false"/>
                       <w:bCs w:val="false"/>
                       <w:i w:val="false"/>
@@ -3330,7 +3384,7 @@
                 </w:tcPr>
                 <w:p>
                   <w:pPr>
-                    <w:spacing w:after="0"/>
+                    <w:spacing w:after="0" w:line="204" w:lineRule="auto"/>
                   </w:pPr>
                   <w:sdt>
                     <w:sdtPr>
@@ -3344,13 +3398,16 @@
                     <w:sdtEndPr/>
                     <w:sdtContent>
                       <w:r>
+                        <w:rPr>
+                          <w:rFonts w:ascii="Avenir Next" w:hAnsi="Avenir Next" w:cs="Avenir Next" w:eastAsia="Avenir Next"/>
+                        </w:rPr>
                         <w:t>☐</w:t>
                       </w:r>
                     </w:sdtContent>
                   </w:sdt>
                   <w:r>
                     <w:rPr>
-                      <w:rFonts w:ascii="Calibri" w:cs="Calibri" w:eastAsia="Times New Roman" w:hAnsi="Calibri"/>
+                      <w:rFonts w:ascii="Avenir Next" w:cs="Avenir Next" w:eastAsia="Avenir Next" w:hAnsi="Avenir Next"/>
                       <w:b w:val="false"/>
                       <w:bCs w:val="false"/>
                       <w:i w:val="false"/>
@@ -3372,13 +3429,16 @@
                     <w:sdtEndPr/>
                     <w:sdtContent>
                       <w:r>
+                        <w:rPr>
+                          <w:rFonts w:ascii="Avenir Next" w:hAnsi="Avenir Next" w:cs="Avenir Next" w:eastAsia="Avenir Next"/>
+                        </w:rPr>
                         <w:t>☐</w:t>
                       </w:r>
                     </w:sdtContent>
                   </w:sdt>
                   <w:r>
                     <w:rPr>
-                      <w:rFonts w:ascii="Calibri" w:cs="Calibri" w:eastAsia="Times New Roman" w:hAnsi="Calibri"/>
+                      <w:rFonts w:ascii="Avenir Next" w:cs="Avenir Next" w:eastAsia="Avenir Next" w:hAnsi="Avenir Next"/>
                       <w:b w:val="false"/>
                       <w:bCs w:val="false"/>
                       <w:i w:val="false"/>
@@ -3405,12 +3465,12 @@
                 </w:tcPr>
                 <w:p>
                   <w:pPr>
-                    <w:spacing w:after="0"/>
+                    <w:spacing w:after="0" w:line="204" w:lineRule="auto"/>
                     <w:jc w:val="right"/>
                   </w:pPr>
                   <w:r>
                     <w:rPr>
-                      <w:rFonts w:ascii="Calibri" w:cs="Calibri" w:eastAsia="Times New Roman" w:hAnsi="Calibri"/>
+                      <w:rFonts w:ascii="Avenir Next Condensed" w:cs="Avenir Next Condensed" w:eastAsia="Avenir Next Condensed" w:hAnsi="Avenir Next Condensed"/>
                       <w:b/>
                       <w:bCs/>
                       <w:i w:val="false"/>
@@ -3435,7 +3495,7 @@
                 </w:tcPr>
                 <w:p>
                   <w:pPr>
-                    <w:spacing w:after="0"/>
+                    <w:spacing w:after="0" w:line="204" w:lineRule="auto"/>
                   </w:pPr>
                   <w:sdt>
                     <w:sdtPr>
@@ -3449,13 +3509,16 @@
                     <w:sdtEndPr/>
                     <w:sdtContent>
                       <w:r>
+                        <w:rPr>
+                          <w:rFonts w:ascii="Avenir Next" w:hAnsi="Avenir Next" w:cs="Avenir Next" w:eastAsia="Avenir Next"/>
+                        </w:rPr>
                         <w:t>☐</w:t>
                       </w:r>
                     </w:sdtContent>
                   </w:sdt>
                   <w:r>
                     <w:rPr>
-                      <w:rFonts w:ascii="Calibri" w:hAnsi="Calibri" w:cs="Calibri"/>
+                      <w:rFonts w:ascii="Avenir Next" w:hAnsi="Avenir Next" w:cs="Avenir Next" w:eastAsia="Avenir Next"/>
                     </w:rPr>
                     <w:t xml:space="preserve"> Flat     </w:t>
                   </w:r>
@@ -3471,13 +3534,16 @@
                     <w:sdtEndPr/>
                     <w:sdtContent>
                       <w:r>
+                        <w:rPr>
+                          <w:rFonts w:ascii="Avenir Next" w:hAnsi="Avenir Next" w:cs="Avenir Next" w:eastAsia="Avenir Next"/>
+                        </w:rPr>
                         <w:t>☐</w:t>
                       </w:r>
                     </w:sdtContent>
                   </w:sdt>
                   <w:r>
                     <w:rPr>
-                      <w:rFonts w:ascii="Calibri" w:hAnsi="Calibri" w:cs="Calibri"/>
+                      <w:rFonts w:ascii="Avenir Next" w:hAnsi="Avenir Next" w:cs="Avenir Next" w:eastAsia="Avenir Next"/>
                     </w:rPr>
                     <w:t xml:space="preserve"> Riser</w:t>
                   </w:r>
@@ -3496,7 +3562,7 @@
                 </w:tcPr>
                 <w:p>
                   <w:pPr>
-                    <w:spacing w:after="0"/>
+                    <w:spacing w:after="0" w:line="204" w:lineRule="auto"/>
                   </w:pPr>
                   <w:sdt>
                     <w:sdtPr>
@@ -3510,13 +3576,16 @@
                     <w:sdtEndPr/>
                     <w:sdtContent>
                       <w:r>
+                        <w:rPr>
+                          <w:rFonts w:ascii="Avenir Next" w:hAnsi="Avenir Next" w:cs="Avenir Next" w:eastAsia="Avenir Next"/>
+                        </w:rPr>
                         <w:t>☐</w:t>
                       </w:r>
                     </w:sdtContent>
                   </w:sdt>
                   <w:r>
                     <w:rPr>
-                      <w:rFonts w:ascii="Calibri" w:hAnsi="Calibri" w:cs="Calibri"/>
+                      <w:rFonts w:ascii="Avenir Next" w:hAnsi="Avenir Next" w:cs="Avenir Next" w:eastAsia="Avenir Next"/>
                     </w:rPr>
                     <w:t xml:space="preserve"> Flat     </w:t>
                   </w:r>
@@ -3532,13 +3601,16 @@
                     <w:sdtEndPr/>
                     <w:sdtContent>
                       <w:r>
+                        <w:rPr>
+                          <w:rFonts w:ascii="Avenir Next" w:hAnsi="Avenir Next" w:cs="Avenir Next" w:eastAsia="Avenir Next"/>
+                        </w:rPr>
                         <w:t>☐</w:t>
                       </w:r>
                     </w:sdtContent>
                   </w:sdt>
                   <w:r>
                     <w:rPr>
-                      <w:rFonts w:ascii="Calibri" w:hAnsi="Calibri" w:cs="Calibri"/>
+                      <w:rFonts w:ascii="Avenir Next" w:hAnsi="Avenir Next" w:cs="Avenir Next" w:eastAsia="Avenir Next"/>
                     </w:rPr>
                     <w:t xml:space="preserve"> Riser</w:t>
                   </w:r>
@@ -3557,7 +3629,7 @@
                 </w:tcPr>
                 <w:p>
                   <w:pPr>
-                    <w:spacing w:after="0"/>
+                    <w:spacing w:after="0" w:line="204" w:lineRule="auto"/>
                   </w:pPr>
                   <w:sdt>
                     <w:sdtPr>
@@ -3571,13 +3643,16 @@
                     <w:sdtEndPr/>
                     <w:sdtContent>
                       <w:r>
+                        <w:rPr>
+                          <w:rFonts w:ascii="Avenir Next" w:hAnsi="Avenir Next" w:cs="Avenir Next" w:eastAsia="Avenir Next"/>
+                        </w:rPr>
                         <w:t>☐</w:t>
                       </w:r>
                     </w:sdtContent>
                   </w:sdt>
                   <w:r>
                     <w:rPr>
-                      <w:rFonts w:ascii="Calibri" w:hAnsi="Calibri" w:cs="Calibri"/>
+                      <w:rFonts w:ascii="Avenir Next" w:hAnsi="Avenir Next" w:cs="Avenir Next" w:eastAsia="Avenir Next"/>
                     </w:rPr>
                     <w:t xml:space="preserve"> Flat     </w:t>
                   </w:r>
@@ -3593,13 +3668,16 @@
                     <w:sdtEndPr/>
                     <w:sdtContent>
                       <w:r>
+                        <w:rPr>
+                          <w:rFonts w:ascii="Avenir Next" w:hAnsi="Avenir Next" w:cs="Avenir Next" w:eastAsia="Avenir Next"/>
+                        </w:rPr>
                         <w:t>☐</w:t>
                       </w:r>
                     </w:sdtContent>
                   </w:sdt>
                   <w:r>
                     <w:rPr>
-                      <w:rFonts w:ascii="Calibri" w:hAnsi="Calibri" w:cs="Calibri"/>
+                      <w:rFonts w:ascii="Avenir Next" w:hAnsi="Avenir Next" w:cs="Avenir Next" w:eastAsia="Avenir Next"/>
                     </w:rPr>
                     <w:t xml:space="preserve"> Riser</w:t>
                   </w:r>
@@ -3620,12 +3698,12 @@
                 </w:tcPr>
                 <w:p>
                   <w:pPr>
-                    <w:spacing w:after="0"/>
+                    <w:spacing w:after="0" w:line="204" w:lineRule="auto"/>
                     <w:jc w:val="right"/>
                   </w:pPr>
                   <w:r>
                     <w:rPr>
-                      <w:rFonts w:ascii="Calibri" w:cs="Calibri" w:eastAsia="Times New Roman" w:hAnsi="Calibri"/>
+                      <w:rFonts w:ascii="Avenir Next Condensed" w:cs="Avenir Next Condensed" w:eastAsia="Avenir Next Condensed" w:hAnsi="Avenir Next Condensed"/>
                       <w:b/>
                       <w:bCs/>
                       <w:i w:val="false"/>
@@ -3650,11 +3728,11 @@
                 </w:tcPr>
                 <w:p>
                   <w:pPr>
-                    <w:spacing w:after="0"/>
-                  </w:pPr>
-                  <w:r>
-                    <w:rPr>
-                      <w:rFonts w:ascii="Calibri" w:cs="Calibri" w:eastAsia="Times New Roman" w:hAnsi="Calibri"/>
+                    <w:spacing w:after="0" w:line="204" w:lineRule="auto"/>
+                  </w:pPr>
+                  <w:r>
+                    <w:rPr>
+                      <w:rFonts w:ascii="Avenir Next" w:cs="Avenir Next" w:eastAsia="Avenir Next" w:hAnsi="Avenir Next"/>
                       <w:b w:val="false"/>
                       <w:bCs w:val="false"/>
                       <w:i w:val="false"/>
@@ -3679,11 +3757,11 @@
                 </w:tcPr>
                 <w:p>
                   <w:pPr>
-                    <w:spacing w:after="0"/>
-                  </w:pPr>
-                  <w:r>
-                    <w:rPr>
-                      <w:rFonts w:ascii="Calibri" w:cs="Calibri" w:eastAsia="Times New Roman" w:hAnsi="Calibri"/>
+                    <w:spacing w:after="0" w:line="204" w:lineRule="auto"/>
+                  </w:pPr>
+                  <w:r>
+                    <w:rPr>
+                      <w:rFonts w:ascii="Avenir Next" w:cs="Avenir Next" w:eastAsia="Avenir Next" w:hAnsi="Avenir Next"/>
                       <w:b w:val="false"/>
                       <w:bCs w:val="false"/>
                       <w:i w:val="false"/>
@@ -3708,11 +3786,11 @@
                 </w:tcPr>
                 <w:p>
                   <w:pPr>
-                    <w:spacing w:after="0"/>
-                  </w:pPr>
-                  <w:r>
-                    <w:rPr>
-                      <w:rFonts w:ascii="Calibri" w:cs="Calibri" w:eastAsia="Times New Roman" w:hAnsi="Calibri"/>
+                    <w:spacing w:after="0" w:line="204" w:lineRule="auto"/>
+                  </w:pPr>
+                  <w:r>
+                    <w:rPr>
+                      <w:rFonts w:ascii="Avenir Next" w:cs="Avenir Next" w:eastAsia="Avenir Next" w:hAnsi="Avenir Next"/>
                       <w:b w:val="false"/>
                       <w:bCs w:val="false"/>
                       <w:i w:val="false"/>
@@ -3739,12 +3817,12 @@
                 </w:tcPr>
                 <w:p>
                   <w:pPr>
-                    <w:spacing w:after="0"/>
+                    <w:spacing w:after="0" w:line="204" w:lineRule="auto"/>
                     <w:jc w:val="right"/>
                   </w:pPr>
                   <w:r>
                     <w:rPr>
-                      <w:rFonts w:ascii="Calibri" w:cs="Calibri" w:eastAsia="Times New Roman" w:hAnsi="Calibri"/>
+                      <w:rFonts w:ascii="Avenir Next Condensed" w:cs="Avenir Next Condensed" w:eastAsia="Avenir Next Condensed" w:hAnsi="Avenir Next Condensed"/>
                       <w:b/>
                       <w:bCs/>
                       <w:i w:val="false"/>
@@ -3769,67 +3847,67 @@
                 </w:tcPr>
                 <w:p>
                   <w:pPr>
-                    <w:spacing w:after="0"/>
-                  </w:pPr>
-                  <w:r>
-                    <w:rPr>
-                      <w:rFonts w:ascii="Calibri" w:cs="Calibri" w:eastAsia="Times New Roman" w:hAnsi="Calibri"/>
-                      <w:b w:val="false"/>
-                      <w:bCs w:val="false"/>
-                      <w:i w:val="false"/>
-                      <w:iCs w:val="false"/>
-                      <w:sz w:val="20"/>
-                      <w:szCs w:val="20"/>
-                    </w:rPr>
-                  </w:r>
-                </w:p>
-              </w:tc>
-              <w:tc>
-                <w:tcPr>
-                  <w:tcW w:type="dxa" w:w="1850"/>
-                  <w:tcMar>
-                    <w:top w:type="dxa" w:w="40"/>
-                    <w:left w:type="dxa" w:w="80"/>
-                    <w:bottom w:type="dxa" w:w="40"/>
-                    <w:right w:type="dxa" w:w="80"/>
-                  </w:tcMar>
-                  <w:vAlign w:val="top"/>
-                </w:tcPr>
-                <w:p>
-                  <w:pPr>
-                    <w:spacing w:after="0"/>
-                  </w:pPr>
-                  <w:r>
-                    <w:rPr>
-                      <w:rFonts w:ascii="Calibri" w:cs="Calibri" w:eastAsia="Times New Roman" w:hAnsi="Calibri"/>
-                      <w:b w:val="false"/>
-                      <w:bCs w:val="false"/>
-                      <w:i w:val="false"/>
-                      <w:iCs w:val="false"/>
-                      <w:sz w:val="20"/>
-                      <w:szCs w:val="20"/>
-                    </w:rPr>
-                  </w:r>
-                </w:p>
-              </w:tc>
-              <w:tc>
-                <w:tcPr>
-                  <w:tcW w:type="dxa" w:w="1850"/>
-                  <w:tcMar>
-                    <w:top w:type="dxa" w:w="40"/>
-                    <w:left w:type="dxa" w:w="80"/>
-                    <w:bottom w:type="dxa" w:w="40"/>
-                    <w:right w:type="dxa" w:w="80"/>
-                  </w:tcMar>
-                  <w:vAlign w:val="top"/>
-                </w:tcPr>
-                <w:p>
-                  <w:pPr>
-                    <w:spacing w:after="0"/>
-                  </w:pPr>
-                  <w:r>
-                    <w:rPr>
-                      <w:rFonts w:ascii="Calibri" w:cs="Calibri" w:eastAsia="Times New Roman" w:hAnsi="Calibri"/>
+                    <w:spacing w:after="0" w:line="204" w:lineRule="auto"/>
+                  </w:pPr>
+                  <w:r>
+                    <w:rPr>
+                      <w:rFonts w:ascii="Avenir Next" w:cs="Avenir Next" w:eastAsia="Avenir Next" w:hAnsi="Avenir Next"/>
+                      <w:b w:val="false"/>
+                      <w:bCs w:val="false"/>
+                      <w:i w:val="false"/>
+                      <w:iCs w:val="false"/>
+                      <w:sz w:val="20"/>
+                      <w:szCs w:val="20"/>
+                    </w:rPr>
+                  </w:r>
+                </w:p>
+              </w:tc>
+              <w:tc>
+                <w:tcPr>
+                  <w:tcW w:type="dxa" w:w="1850"/>
+                  <w:tcMar>
+                    <w:top w:type="dxa" w:w="40"/>
+                    <w:left w:type="dxa" w:w="80"/>
+                    <w:bottom w:type="dxa" w:w="40"/>
+                    <w:right w:type="dxa" w:w="80"/>
+                  </w:tcMar>
+                  <w:vAlign w:val="top"/>
+                </w:tcPr>
+                <w:p>
+                  <w:pPr>
+                    <w:spacing w:after="0" w:line="204" w:lineRule="auto"/>
+                  </w:pPr>
+                  <w:r>
+                    <w:rPr>
+                      <w:rFonts w:ascii="Avenir Next" w:cs="Avenir Next" w:eastAsia="Avenir Next" w:hAnsi="Avenir Next"/>
+                      <w:b w:val="false"/>
+                      <w:bCs w:val="false"/>
+                      <w:i w:val="false"/>
+                      <w:iCs w:val="false"/>
+                      <w:sz w:val="20"/>
+                      <w:szCs w:val="20"/>
+                    </w:rPr>
+                  </w:r>
+                </w:p>
+              </w:tc>
+              <w:tc>
+                <w:tcPr>
+                  <w:tcW w:type="dxa" w:w="1850"/>
+                  <w:tcMar>
+                    <w:top w:type="dxa" w:w="40"/>
+                    <w:left w:type="dxa" w:w="80"/>
+                    <w:bottom w:type="dxa" w:w="40"/>
+                    <w:right w:type="dxa" w:w="80"/>
+                  </w:tcMar>
+                  <w:vAlign w:val="top"/>
+                </w:tcPr>
+                <w:p>
+                  <w:pPr>
+                    <w:spacing w:after="0" w:line="204" w:lineRule="auto"/>
+                  </w:pPr>
+                  <w:r>
+                    <w:rPr>
+                      <w:rFonts w:ascii="Avenir Next" w:cs="Avenir Next" w:eastAsia="Avenir Next" w:hAnsi="Avenir Next"/>
                       <w:b w:val="false"/>
                       <w:bCs w:val="false"/>
                       <w:i w:val="false"/>
@@ -3855,12 +3933,12 @@
                 </w:tcPr>
                 <w:p>
                   <w:pPr>
-                    <w:spacing w:after="0"/>
+                    <w:spacing w:after="0" w:line="204" w:lineRule="auto"/>
                     <w:jc w:val="right"/>
                   </w:pPr>
                   <w:r>
                     <w:rPr>
-                      <w:rFonts w:ascii="Calibri" w:cs="Calibri" w:eastAsia="Times New Roman" w:hAnsi="Calibri"/>
+                      <w:rFonts w:ascii="Avenir Next Condensed" w:cs="Avenir Next Condensed" w:eastAsia="Avenir Next Condensed" w:hAnsi="Avenir Next Condensed"/>
                       <w:b/>
                       <w:bCs/>
                       <w:i w:val="false"/>
@@ -3885,11 +3963,11 @@
                 </w:tcPr>
                 <w:p>
                   <w:pPr>
-                    <w:spacing w:after="0"/>
-                  </w:pPr>
-                  <w:r>
-                    <w:rPr>
-                      <w:rFonts w:ascii="Calibri" w:cs="Calibri" w:eastAsia="Times New Roman" w:hAnsi="Calibri"/>
+                    <w:spacing w:after="0" w:line="204" w:lineRule="auto"/>
+                  </w:pPr>
+                  <w:r>
+                    <w:rPr>
+                      <w:rFonts w:ascii="Avenir Next" w:cs="Avenir Next" w:eastAsia="Avenir Next" w:hAnsi="Avenir Next"/>
                       <w:b w:val="false"/>
                       <w:bCs w:val="false"/>
                       <w:i w:val="false"/>
@@ -3914,11 +3992,11 @@
                 </w:tcPr>
                 <w:p>
                   <w:pPr>
-                    <w:spacing w:after="0"/>
-                  </w:pPr>
-                  <w:r>
-                    <w:rPr>
-                      <w:rFonts w:ascii="Calibri" w:cs="Calibri" w:eastAsia="Times New Roman" w:hAnsi="Calibri"/>
+                    <w:spacing w:after="0" w:line="204" w:lineRule="auto"/>
+                  </w:pPr>
+                  <w:r>
+                    <w:rPr>
+                      <w:rFonts w:ascii="Avenir Next" w:cs="Avenir Next" w:eastAsia="Avenir Next" w:hAnsi="Avenir Next"/>
                       <w:b w:val="false"/>
                       <w:bCs w:val="false"/>
                       <w:i w:val="false"/>
@@ -3943,11 +4021,11 @@
                 </w:tcPr>
                 <w:p>
                   <w:pPr>
-                    <w:spacing w:after="0"/>
-                  </w:pPr>
-                  <w:r>
-                    <w:rPr>
-                      <w:rFonts w:ascii="Calibri" w:cs="Calibri" w:eastAsia="Times New Roman" w:hAnsi="Calibri"/>
+                    <w:spacing w:after="0" w:line="204" w:lineRule="auto"/>
+                  </w:pPr>
+                  <w:r>
+                    <w:rPr>
+                      <w:rFonts w:ascii="Avenir Next" w:cs="Avenir Next" w:eastAsia="Avenir Next" w:hAnsi="Avenir Next"/>
                       <w:b w:val="false"/>
                       <w:bCs w:val="false"/>
                       <w:i w:val="false"/>
@@ -3964,28 +4042,29 @@
               <w:tc>
                 <w:tcPr>
                   <w:tcW w:type="dxa" w:w="1750"/>
-                  <w:shd w:fill="EAE7DD" w:color="auto" w:val="clear"/>
-                  <w:tcMar>
-                    <w:top w:type="dxa" w:w="40"/>
-                    <w:left w:type="dxa" w:w="80"/>
-                    <w:bottom w:type="dxa" w:w="40"/>
-                    <w:right w:type="dxa" w:w="80"/>
-                  </w:tcMar>
-                  <w:vAlign w:val="top"/>
-                </w:tcPr>
-                <w:p>
-                  <w:pPr>
-                    <w:spacing w:after="0"/>
-                  </w:pPr>
-                  <w:r>
-                    <w:rPr>
-                      <w:rFonts w:ascii="Calibri" w:cs="Calibri" w:eastAsia="Times New Roman" w:hAnsi="Calibri"/>
+                  <w:shd w:fill="595A5C" w:color="auto" w:val="clear"/>
+                  <w:tcMar>
+                    <w:top w:type="dxa" w:w="40"/>
+                    <w:left w:type="dxa" w:w="80"/>
+                    <w:bottom w:type="dxa" w:w="40"/>
+                    <w:right w:type="dxa" w:w="80"/>
+                  </w:tcMar>
+                  <w:vAlign w:val="top"/>
+                </w:tcPr>
+                <w:p>
+                  <w:pPr>
+                    <w:spacing w:after="0" w:line="204" w:lineRule="auto"/>
+                  </w:pPr>
+                  <w:r>
+                    <w:rPr>
+                      <w:rFonts w:ascii="Avenir Next Condensed" w:cs="Avenir Next Condensed" w:eastAsia="Avenir Next Condensed" w:hAnsi="Avenir Next Condensed"/>
                       <w:b/>
                       <w:bCs/>
                       <w:i w:val="false"/>
                       <w:iCs w:val="false"/>
                       <w:sz w:val="20"/>
                       <w:szCs w:val="20"/>
+                      <w:color w:val="FFFFFF"/>
                     </w:rPr>
                     <w:t xml:space="preserve">MISC</w:t>
                   </w:r>
@@ -3995,28 +4074,29 @@
                 <w:tcPr>
                   <w:tcW w:type="dxa" w:w="5550"/>
                   <w:gridSpan w:val="3"/>
-                  <w:shd w:fill="EAE7DD" w:color="auto" w:val="clear"/>
-                  <w:tcMar>
-                    <w:top w:type="dxa" w:w="40"/>
-                    <w:left w:type="dxa" w:w="80"/>
-                    <w:bottom w:type="dxa" w:w="40"/>
-                    <w:right w:type="dxa" w:w="80"/>
-                  </w:tcMar>
-                  <w:vAlign w:val="top"/>
-                </w:tcPr>
-                <w:p>
-                  <w:pPr>
-                    <w:spacing w:after="0"/>
-                  </w:pPr>
-                  <w:r>
-                    <w:rPr>
-                      <w:rFonts w:ascii="Calibri" w:cs="Calibri" w:eastAsia="Times New Roman" w:hAnsi="Calibri"/>
-                      <w:b w:val="false"/>
-                      <w:bCs w:val="false"/>
-                      <w:i w:val="false"/>
-                      <w:iCs w:val="false"/>
-                      <w:sz w:val="20"/>
-                      <w:szCs w:val="20"/>
+                  <w:shd w:fill="595A5C" w:color="auto" w:val="clear"/>
+                  <w:tcMar>
+                    <w:top w:type="dxa" w:w="40"/>
+                    <w:left w:type="dxa" w:w="80"/>
+                    <w:bottom w:type="dxa" w:w="40"/>
+                    <w:right w:type="dxa" w:w="80"/>
+                  </w:tcMar>
+                  <w:vAlign w:val="top"/>
+                </w:tcPr>
+                <w:p>
+                  <w:pPr>
+                    <w:spacing w:after="0" w:line="204" w:lineRule="auto"/>
+                  </w:pPr>
+                  <w:r>
+                    <w:rPr>
+                      <w:rFonts w:ascii="Avenir Next" w:cs="Avenir Next" w:eastAsia="Avenir Next" w:hAnsi="Avenir Next"/>
+                      <w:b w:val="false"/>
+                      <w:bCs w:val="false"/>
+                      <w:i w:val="false"/>
+                      <w:iCs w:val="false"/>
+                      <w:sz w:val="20"/>
+                      <w:szCs w:val="20"/>
+                      <w:color w:val="FFFFFF"/>
                     </w:rPr>
                     <w:t xml:space="preserve"/>
                   </w:r>
@@ -4037,12 +4117,12 @@
                 </w:tcPr>
                 <w:p>
                   <w:pPr>
-                    <w:spacing w:after="0"/>
+                    <w:spacing w:after="0" w:line="204" w:lineRule="auto"/>
                     <w:jc w:val="right"/>
                   </w:pPr>
                   <w:r>
                     <w:rPr>
-                      <w:rFonts w:ascii="Calibri" w:cs="Calibri" w:eastAsia="Times New Roman" w:hAnsi="Calibri"/>
+                      <w:rFonts w:ascii="Avenir Next Condensed" w:cs="Avenir Next Condensed" w:eastAsia="Avenir Next Condensed" w:hAnsi="Avenir Next Condensed"/>
                       <w:b/>
                       <w:bCs/>
                       <w:i w:val="false"/>
@@ -4067,11 +4147,11 @@
                 </w:tcPr>
                 <w:p>
                   <w:pPr>
-                    <w:spacing w:after="0"/>
-                  </w:pPr>
-                  <w:r>
-                    <w:rPr>
-                      <w:rFonts w:ascii="Calibri" w:cs="Calibri" w:eastAsia="Times New Roman" w:hAnsi="Calibri"/>
+                    <w:spacing w:after="0" w:line="204" w:lineRule="auto"/>
+                  </w:pPr>
+                  <w:r>
+                    <w:rPr>
+                      <w:rFonts w:ascii="Avenir Next" w:cs="Avenir Next" w:eastAsia="Avenir Next" w:hAnsi="Avenir Next"/>
                       <w:b w:val="false"/>
                       <w:bCs w:val="false"/>
                       <w:i w:val="false"/>
@@ -4096,11 +4176,11 @@
                 </w:tcPr>
                 <w:p>
                   <w:pPr>
-                    <w:spacing w:after="0"/>
-                  </w:pPr>
-                  <w:r>
-                    <w:rPr>
-                      <w:rFonts w:ascii="Calibri" w:cs="Calibri" w:eastAsia="Times New Roman" w:hAnsi="Calibri"/>
+                    <w:spacing w:after="0" w:line="204" w:lineRule="auto"/>
+                  </w:pPr>
+                  <w:r>
+                    <w:rPr>
+                      <w:rFonts w:ascii="Avenir Next" w:cs="Avenir Next" w:eastAsia="Avenir Next" w:hAnsi="Avenir Next"/>
                       <w:b w:val="false"/>
                       <w:bCs w:val="false"/>
                       <w:i w:val="false"/>
@@ -4125,11 +4205,11 @@
                 </w:tcPr>
                 <w:p>
                   <w:pPr>
-                    <w:spacing w:after="0"/>
-                  </w:pPr>
-                  <w:r>
-                    <w:rPr>
-                      <w:rFonts w:ascii="Calibri" w:cs="Calibri" w:eastAsia="Times New Roman" w:hAnsi="Calibri"/>
+                    <w:spacing w:after="0" w:line="204" w:lineRule="auto"/>
+                  </w:pPr>
+                  <w:r>
+                    <w:rPr>
+                      <w:rFonts w:ascii="Avenir Next" w:cs="Avenir Next" w:eastAsia="Avenir Next" w:hAnsi="Avenir Next"/>
                       <w:b w:val="false"/>
                       <w:bCs w:val="false"/>
                       <w:i w:val="false"/>
@@ -4156,12 +4236,12 @@
                 </w:tcPr>
                 <w:p>
                   <w:pPr>
-                    <w:spacing w:after="0"/>
+                    <w:spacing w:after="0" w:line="204" w:lineRule="auto"/>
                     <w:jc w:val="right"/>
                   </w:pPr>
                   <w:r>
                     <w:rPr>
-                      <w:rFonts w:ascii="Calibri" w:cs="Calibri" w:eastAsia="Times New Roman" w:hAnsi="Calibri"/>
+                      <w:rFonts w:ascii="Avenir Next Condensed" w:cs="Avenir Next Condensed" w:eastAsia="Avenir Next Condensed" w:hAnsi="Avenir Next Condensed"/>
                       <w:b/>
                       <w:bCs/>
                       <w:i w:val="false"/>
@@ -4186,11 +4266,11 @@
                 </w:tcPr>
                 <w:p>
                   <w:pPr>
-                    <w:spacing w:after="0"/>
-                  </w:pPr>
-                  <w:r>
-                    <w:rPr>
-                      <w:rFonts w:ascii="Calibri" w:cs="Calibri" w:eastAsia="Times New Roman" w:hAnsi="Calibri"/>
+                    <w:spacing w:after="0" w:line="204" w:lineRule="auto"/>
+                  </w:pPr>
+                  <w:r>
+                    <w:rPr>
+                      <w:rFonts w:ascii="Avenir Next" w:cs="Avenir Next" w:eastAsia="Avenir Next" w:hAnsi="Avenir Next"/>
                       <w:b w:val="false"/>
                       <w:bCs w:val="false"/>
                       <w:i w:val="false"/>
@@ -4215,11 +4295,11 @@
                 </w:tcPr>
                 <w:p>
                   <w:pPr>
-                    <w:spacing w:after="0"/>
-                  </w:pPr>
-                  <w:r>
-                    <w:rPr>
-                      <w:rFonts w:ascii="Calibri" w:cs="Calibri" w:eastAsia="Times New Roman" w:hAnsi="Calibri"/>
+                    <w:spacing w:after="0" w:line="204" w:lineRule="auto"/>
+                  </w:pPr>
+                  <w:r>
+                    <w:rPr>
+                      <w:rFonts w:ascii="Avenir Next" w:cs="Avenir Next" w:eastAsia="Avenir Next" w:hAnsi="Avenir Next"/>
                       <w:b w:val="false"/>
                       <w:bCs w:val="false"/>
                       <w:i w:val="false"/>
@@ -4244,11 +4324,11 @@
                 </w:tcPr>
                 <w:p>
                   <w:pPr>
-                    <w:spacing w:after="0"/>
-                  </w:pPr>
-                  <w:r>
-                    <w:rPr>
-                      <w:rFonts w:ascii="Calibri" w:cs="Calibri" w:eastAsia="Times New Roman" w:hAnsi="Calibri"/>
+                    <w:spacing w:after="0" w:line="204" w:lineRule="auto"/>
+                  </w:pPr>
+                  <w:r>
+                    <w:rPr>
+                      <w:rFonts w:ascii="Avenir Next" w:cs="Avenir Next" w:eastAsia="Avenir Next" w:hAnsi="Avenir Next"/>
                       <w:b w:val="false"/>
                       <w:bCs w:val="false"/>
                       <w:i w:val="false"/>
@@ -4275,12 +4355,12 @@
                 </w:tcPr>
                 <w:p>
                   <w:pPr>
-                    <w:spacing w:after="0"/>
+                    <w:spacing w:after="0" w:line="204" w:lineRule="auto"/>
                     <w:jc w:val="right"/>
                   </w:pPr>
                   <w:r>
                     <w:rPr>
-                      <w:rFonts w:ascii="Calibri" w:cs="Calibri" w:eastAsia="Times New Roman" w:hAnsi="Calibri"/>
+                      <w:rFonts w:ascii="Avenir Next Condensed" w:cs="Avenir Next Condensed" w:eastAsia="Avenir Next Condensed" w:hAnsi="Avenir Next Condensed"/>
                       <w:b/>
                       <w:bCs/>
                       <w:i w:val="false"/>
@@ -4305,67 +4385,67 @@
                 </w:tcPr>
                 <w:p>
                   <w:pPr>
-                    <w:spacing w:after="0"/>
-                  </w:pPr>
-                  <w:r>
-                    <w:rPr>
-                      <w:rFonts w:ascii="Calibri" w:cs="Calibri" w:eastAsia="Times New Roman" w:hAnsi="Calibri"/>
-                      <w:b w:val="false"/>
-                      <w:bCs w:val="false"/>
-                      <w:i w:val="false"/>
-                      <w:iCs w:val="false"/>
-                      <w:sz w:val="20"/>
-                      <w:szCs w:val="20"/>
-                    </w:rPr>
-                  </w:r>
-                </w:p>
-              </w:tc>
-              <w:tc>
-                <w:tcPr>
-                  <w:tcW w:type="dxa" w:w="1850"/>
-                  <w:tcMar>
-                    <w:top w:type="dxa" w:w="40"/>
-                    <w:left w:type="dxa" w:w="80"/>
-                    <w:bottom w:type="dxa" w:w="40"/>
-                    <w:right w:type="dxa" w:w="80"/>
-                  </w:tcMar>
-                  <w:vAlign w:val="top"/>
-                </w:tcPr>
-                <w:p>
-                  <w:pPr>
-                    <w:spacing w:after="0"/>
-                  </w:pPr>
-                  <w:r>
-                    <w:rPr>
-                      <w:rFonts w:ascii="Calibri" w:cs="Calibri" w:eastAsia="Times New Roman" w:hAnsi="Calibri"/>
-                      <w:b w:val="false"/>
-                      <w:bCs w:val="false"/>
-                      <w:i w:val="false"/>
-                      <w:iCs w:val="false"/>
-                      <w:sz w:val="20"/>
-                      <w:szCs w:val="20"/>
-                    </w:rPr>
-                  </w:r>
-                </w:p>
-              </w:tc>
-              <w:tc>
-                <w:tcPr>
-                  <w:tcW w:type="dxa" w:w="1850"/>
-                  <w:tcMar>
-                    <w:top w:type="dxa" w:w="40"/>
-                    <w:left w:type="dxa" w:w="80"/>
-                    <w:bottom w:type="dxa" w:w="40"/>
-                    <w:right w:type="dxa" w:w="80"/>
-                  </w:tcMar>
-                  <w:vAlign w:val="top"/>
-                </w:tcPr>
-                <w:p>
-                  <w:pPr>
-                    <w:spacing w:after="0"/>
-                  </w:pPr>
-                  <w:r>
-                    <w:rPr>
-                      <w:rFonts w:ascii="Calibri" w:cs="Calibri" w:eastAsia="Times New Roman" w:hAnsi="Calibri"/>
+                    <w:spacing w:after="0" w:line="204" w:lineRule="auto"/>
+                  </w:pPr>
+                  <w:r>
+                    <w:rPr>
+                      <w:rFonts w:ascii="Avenir Next" w:cs="Avenir Next" w:eastAsia="Avenir Next" w:hAnsi="Avenir Next"/>
+                      <w:b w:val="false"/>
+                      <w:bCs w:val="false"/>
+                      <w:i w:val="false"/>
+                      <w:iCs w:val="false"/>
+                      <w:sz w:val="20"/>
+                      <w:szCs w:val="20"/>
+                    </w:rPr>
+                  </w:r>
+                </w:p>
+              </w:tc>
+              <w:tc>
+                <w:tcPr>
+                  <w:tcW w:type="dxa" w:w="1850"/>
+                  <w:tcMar>
+                    <w:top w:type="dxa" w:w="40"/>
+                    <w:left w:type="dxa" w:w="80"/>
+                    <w:bottom w:type="dxa" w:w="40"/>
+                    <w:right w:type="dxa" w:w="80"/>
+                  </w:tcMar>
+                  <w:vAlign w:val="top"/>
+                </w:tcPr>
+                <w:p>
+                  <w:pPr>
+                    <w:spacing w:after="0" w:line="204" w:lineRule="auto"/>
+                  </w:pPr>
+                  <w:r>
+                    <w:rPr>
+                      <w:rFonts w:ascii="Avenir Next" w:cs="Avenir Next" w:eastAsia="Avenir Next" w:hAnsi="Avenir Next"/>
+                      <w:b w:val="false"/>
+                      <w:bCs w:val="false"/>
+                      <w:i w:val="false"/>
+                      <w:iCs w:val="false"/>
+                      <w:sz w:val="20"/>
+                      <w:szCs w:val="20"/>
+                    </w:rPr>
+                  </w:r>
+                </w:p>
+              </w:tc>
+              <w:tc>
+                <w:tcPr>
+                  <w:tcW w:type="dxa" w:w="1850"/>
+                  <w:tcMar>
+                    <w:top w:type="dxa" w:w="40"/>
+                    <w:left w:type="dxa" w:w="80"/>
+                    <w:bottom w:type="dxa" w:w="40"/>
+                    <w:right w:type="dxa" w:w="80"/>
+                  </w:tcMar>
+                  <w:vAlign w:val="top"/>
+                </w:tcPr>
+                <w:p>
+                  <w:pPr>
+                    <w:spacing w:after="0" w:line="204" w:lineRule="auto"/>
+                  </w:pPr>
+                  <w:r>
+                    <w:rPr>
+                      <w:rFonts w:ascii="Avenir Next" w:cs="Avenir Next" w:eastAsia="Avenir Next" w:hAnsi="Avenir Next"/>
                       <w:b w:val="false"/>
                       <w:bCs w:val="false"/>
                       <w:i w:val="false"/>
@@ -4391,12 +4471,12 @@
                 </w:tcPr>
                 <w:p>
                   <w:pPr>
-                    <w:spacing w:after="0"/>
+                    <w:spacing w:after="0" w:line="204" w:lineRule="auto"/>
                     <w:jc w:val="right"/>
                   </w:pPr>
                   <w:r>
                     <w:rPr>
-                      <w:rFonts w:ascii="Calibri" w:cs="Calibri" w:eastAsia="Times New Roman" w:hAnsi="Calibri"/>
+                      <w:rFonts w:ascii="Avenir Next Condensed" w:cs="Avenir Next Condensed" w:eastAsia="Avenir Next Condensed" w:hAnsi="Avenir Next Condensed"/>
                       <w:b/>
                       <w:bCs/>
                       <w:i w:val="false"/>
@@ -4421,11 +4501,11 @@
                 </w:tcPr>
                 <w:p>
                   <w:pPr>
-                    <w:spacing w:after="0"/>
-                  </w:pPr>
-                  <w:r>
-                    <w:rPr>
-                      <w:rFonts w:ascii="Calibri" w:cs="Calibri" w:eastAsia="Times New Roman" w:hAnsi="Calibri"/>
+                    <w:spacing w:after="0" w:line="204" w:lineRule="auto"/>
+                  </w:pPr>
+                  <w:r>
+                    <w:rPr>
+                      <w:rFonts w:ascii="Avenir Next" w:cs="Avenir Next" w:eastAsia="Avenir Next" w:hAnsi="Avenir Next"/>
                       <w:b w:val="false"/>
                       <w:bCs w:val="false"/>
                       <w:i w:val="false"/>
@@ -4450,11 +4530,11 @@
                 </w:tcPr>
                 <w:p>
                   <w:pPr>
-                    <w:spacing w:after="0"/>
-                  </w:pPr>
-                  <w:r>
-                    <w:rPr>
-                      <w:rFonts w:ascii="Calibri" w:cs="Calibri" w:eastAsia="Times New Roman" w:hAnsi="Calibri"/>
+                    <w:spacing w:after="0" w:line="204" w:lineRule="auto"/>
+                  </w:pPr>
+                  <w:r>
+                    <w:rPr>
+                      <w:rFonts w:ascii="Avenir Next" w:cs="Avenir Next" w:eastAsia="Avenir Next" w:hAnsi="Avenir Next"/>
                       <w:b w:val="false"/>
                       <w:bCs w:val="false"/>
                       <w:i w:val="false"/>
@@ -4479,11 +4559,11 @@
                 </w:tcPr>
                 <w:p>
                   <w:pPr>
-                    <w:spacing w:after="0"/>
-                  </w:pPr>
-                  <w:r>
-                    <w:rPr>
-                      <w:rFonts w:ascii="Calibri" w:cs="Calibri" w:eastAsia="Times New Roman" w:hAnsi="Calibri"/>
+                    <w:spacing w:after="0" w:line="204" w:lineRule="auto"/>
+                  </w:pPr>
+                  <w:r>
+                    <w:rPr>
+                      <w:rFonts w:ascii="Avenir Next" w:cs="Avenir Next" w:eastAsia="Avenir Next" w:hAnsi="Avenir Next"/>
                       <w:b w:val="false"/>
                       <w:bCs w:val="false"/>
                       <w:i w:val="false"/>
@@ -4510,12 +4590,12 @@
                 </w:tcPr>
                 <w:p>
                   <w:pPr>
-                    <w:spacing w:after="0"/>
+                    <w:spacing w:after="0" w:line="204" w:lineRule="auto"/>
                     <w:jc w:val="right"/>
                   </w:pPr>
                   <w:r>
                     <w:rPr>
-                      <w:rFonts w:ascii="Calibri" w:cs="Calibri" w:eastAsia="Times New Roman" w:hAnsi="Calibri"/>
+                      <w:rFonts w:ascii="Avenir Next Condensed" w:cs="Avenir Next Condensed" w:eastAsia="Avenir Next Condensed" w:hAnsi="Avenir Next Condensed"/>
                       <w:b/>
                       <w:bCs/>
                       <w:i w:val="false"/>
@@ -4540,11 +4620,11 @@
                 </w:tcPr>
                 <w:p>
                   <w:pPr>
-                    <w:spacing w:after="0"/>
-                  </w:pPr>
-                  <w:r>
-                    <w:rPr>
-                      <w:rFonts w:ascii="Calibri" w:cs="Calibri" w:eastAsia="Times New Roman" w:hAnsi="Calibri"/>
+                    <w:spacing w:after="0" w:line="204" w:lineRule="auto"/>
+                  </w:pPr>
+                  <w:r>
+                    <w:rPr>
+                      <w:rFonts w:ascii="Avenir Next" w:cs="Avenir Next" w:eastAsia="Avenir Next" w:hAnsi="Avenir Next"/>
                       <w:b w:val="false"/>
                       <w:bCs w:val="false"/>
                       <w:i w:val="false"/>
@@ -4569,11 +4649,11 @@
                 </w:tcPr>
                 <w:p>
                   <w:pPr>
-                    <w:spacing w:after="0"/>
-                  </w:pPr>
-                  <w:r>
-                    <w:rPr>
-                      <w:rFonts w:ascii="Calibri" w:cs="Calibri" w:eastAsia="Times New Roman" w:hAnsi="Calibri"/>
+                    <w:spacing w:after="0" w:line="204" w:lineRule="auto"/>
+                  </w:pPr>
+                  <w:r>
+                    <w:rPr>
+                      <w:rFonts w:ascii="Avenir Next" w:cs="Avenir Next" w:eastAsia="Avenir Next" w:hAnsi="Avenir Next"/>
                       <w:b w:val="false"/>
                       <w:bCs w:val="false"/>
                       <w:i w:val="false"/>
@@ -4598,11 +4678,11 @@
                 </w:tcPr>
                 <w:p>
                   <w:pPr>
-                    <w:spacing w:after="0"/>
-                  </w:pPr>
-                  <w:r>
-                    <w:rPr>
-                      <w:rFonts w:ascii="Calibri" w:cs="Calibri" w:eastAsia="Times New Roman" w:hAnsi="Calibri"/>
+                    <w:spacing w:after="0" w:line="204" w:lineRule="auto"/>
+                  </w:pPr>
+                  <w:r>
+                    <w:rPr>
+                      <w:rFonts w:ascii="Avenir Next" w:cs="Avenir Next" w:eastAsia="Avenir Next" w:hAnsi="Avenir Next"/>
                       <w:b w:val="false"/>
                       <w:bCs w:val="false"/>
                       <w:i w:val="false"/>
@@ -4629,12 +4709,12 @@
                 </w:tcPr>
                 <w:p>
                   <w:pPr>
-                    <w:spacing w:after="0"/>
+                    <w:spacing w:after="0" w:line="204" w:lineRule="auto"/>
                     <w:jc w:val="right"/>
                   </w:pPr>
                   <w:r>
                     <w:rPr>
-                      <w:rFonts w:ascii="Calibri" w:cs="Calibri" w:eastAsia="Times New Roman" w:hAnsi="Calibri"/>
+                      <w:rFonts w:ascii="Avenir Next Condensed" w:cs="Avenir Next Condensed" w:eastAsia="Avenir Next Condensed" w:hAnsi="Avenir Next Condensed"/>
                       <w:b/>
                       <w:bCs/>
                       <w:i w:val="false"/>
@@ -4659,11 +4739,11 @@
                 </w:tcPr>
                 <w:p>
                   <w:pPr>
-                    <w:spacing w:after="0"/>
-                  </w:pPr>
-                  <w:r>
-                    <w:rPr>
-                      <w:rFonts w:ascii="Calibri" w:cs="Calibri" w:eastAsia="Times New Roman" w:hAnsi="Calibri"/>
+                    <w:spacing w:after="0" w:line="204" w:lineRule="auto"/>
+                  </w:pPr>
+                  <w:r>
+                    <w:rPr>
+                      <w:rFonts w:ascii="Avenir Next" w:cs="Avenir Next" w:eastAsia="Avenir Next" w:hAnsi="Avenir Next"/>
                       <w:b w:val="false"/>
                       <w:bCs w:val="false"/>
                       <w:i w:val="false"/>
@@ -4688,11 +4768,11 @@
                 </w:tcPr>
                 <w:p>
                   <w:pPr>
-                    <w:spacing w:after="0"/>
-                  </w:pPr>
-                  <w:r>
-                    <w:rPr>
-                      <w:rFonts w:ascii="Calibri" w:cs="Calibri" w:eastAsia="Times New Roman" w:hAnsi="Calibri"/>
+                    <w:spacing w:after="0" w:line="204" w:lineRule="auto"/>
+                  </w:pPr>
+                  <w:r>
+                    <w:rPr>
+                      <w:rFonts w:ascii="Avenir Next" w:cs="Avenir Next" w:eastAsia="Avenir Next" w:hAnsi="Avenir Next"/>
                       <w:b w:val="false"/>
                       <w:bCs w:val="false"/>
                       <w:i w:val="false"/>
@@ -4717,11 +4797,11 @@
                 </w:tcPr>
                 <w:p>
                   <w:pPr>
-                    <w:spacing w:after="0"/>
-                  </w:pPr>
-                  <w:r>
-                    <w:rPr>
-                      <w:rFonts w:ascii="Calibri" w:cs="Calibri" w:eastAsia="Times New Roman" w:hAnsi="Calibri"/>
+                    <w:spacing w:after="0" w:line="204" w:lineRule="auto"/>
+                  </w:pPr>
+                  <w:r>
+                    <w:rPr>
+                      <w:rFonts w:ascii="Avenir Next" w:cs="Avenir Next" w:eastAsia="Avenir Next" w:hAnsi="Avenir Next"/>
                       <w:b w:val="false"/>
                       <w:bCs w:val="false"/>
                       <w:i w:val="false"/>
@@ -4748,12 +4828,12 @@
                 </w:tcPr>
                 <w:p>
                   <w:pPr>
-                    <w:spacing w:after="0"/>
+                    <w:spacing w:after="0" w:line="204" w:lineRule="auto"/>
                     <w:jc w:val="right"/>
                   </w:pPr>
                   <w:r>
                     <w:rPr>
-                      <w:rFonts w:ascii="Calibri" w:cs="Calibri" w:eastAsia="Times New Roman" w:hAnsi="Calibri"/>
+                      <w:rFonts w:ascii="Avenir Next Condensed" w:cs="Avenir Next Condensed" w:eastAsia="Avenir Next Condensed" w:hAnsi="Avenir Next Condensed"/>
                       <w:b/>
                       <w:bCs/>
                       <w:i w:val="false"/>
@@ -4778,11 +4858,11 @@
                 </w:tcPr>
                 <w:p>
                   <w:pPr>
-                    <w:spacing w:after="0"/>
-                  </w:pPr>
-                  <w:r>
-                    <w:rPr>
-                      <w:rFonts w:ascii="Calibri" w:cs="Calibri" w:eastAsia="Times New Roman" w:hAnsi="Calibri"/>
+                    <w:spacing w:after="0" w:line="204" w:lineRule="auto"/>
+                  </w:pPr>
+                  <w:r>
+                    <w:rPr>
+                      <w:rFonts w:ascii="Avenir Next" w:cs="Avenir Next" w:eastAsia="Avenir Next" w:hAnsi="Avenir Next"/>
                       <w:b w:val="false"/>
                       <w:bCs w:val="false"/>
                       <w:i w:val="false"/>
@@ -4807,11 +4887,11 @@
                 </w:tcPr>
                 <w:p>
                   <w:pPr>
-                    <w:spacing w:after="0"/>
-                  </w:pPr>
-                  <w:r>
-                    <w:rPr>
-                      <w:rFonts w:ascii="Calibri" w:cs="Calibri" w:eastAsia="Times New Roman" w:hAnsi="Calibri"/>
+                    <w:spacing w:after="0" w:line="204" w:lineRule="auto"/>
+                  </w:pPr>
+                  <w:r>
+                    <w:rPr>
+                      <w:rFonts w:ascii="Avenir Next" w:cs="Avenir Next" w:eastAsia="Avenir Next" w:hAnsi="Avenir Next"/>
                       <w:b w:val="false"/>
                       <w:bCs w:val="false"/>
                       <w:i w:val="false"/>
@@ -4836,11 +4916,11 @@
                 </w:tcPr>
                 <w:p>
                   <w:pPr>
-                    <w:spacing w:after="0"/>
-                  </w:pPr>
-                  <w:r>
-                    <w:rPr>
-                      <w:rFonts w:ascii="Calibri" w:cs="Calibri" w:eastAsia="Times New Roman" w:hAnsi="Calibri"/>
+                    <w:spacing w:after="0" w:line="204" w:lineRule="auto"/>
+                  </w:pPr>
+                  <w:r>
+                    <w:rPr>
+                      <w:rFonts w:ascii="Avenir Next" w:cs="Avenir Next" w:eastAsia="Avenir Next" w:hAnsi="Avenir Next"/>
                       <w:b w:val="false"/>
                       <w:bCs w:val="false"/>
                       <w:i w:val="false"/>
@@ -4867,12 +4947,12 @@
                 </w:tcPr>
                 <w:p>
                   <w:pPr>
-                    <w:spacing w:after="0"/>
+                    <w:spacing w:after="0" w:line="204" w:lineRule="auto"/>
                     <w:jc w:val="right"/>
                   </w:pPr>
                   <w:r>
                     <w:rPr>
-                      <w:rFonts w:ascii="Calibri" w:cs="Calibri" w:eastAsia="Times New Roman" w:hAnsi="Calibri"/>
+                      <w:rFonts w:ascii="Avenir Next Condensed" w:cs="Avenir Next Condensed" w:eastAsia="Avenir Next Condensed" w:hAnsi="Avenir Next Condensed"/>
                       <w:b/>
                       <w:bCs/>
                       <w:i w:val="false"/>
@@ -4897,11 +4977,11 @@
                 </w:tcPr>
                 <w:p>
                   <w:pPr>
-                    <w:spacing w:after="0"/>
-                  </w:pPr>
-                  <w:r>
-                    <w:rPr>
-                      <w:rFonts w:ascii="Calibri" w:cs="Calibri" w:eastAsia="Times New Roman" w:hAnsi="Calibri"/>
+                    <w:spacing w:after="0" w:line="204" w:lineRule="auto"/>
+                  </w:pPr>
+                  <w:r>
+                    <w:rPr>
+                      <w:rFonts w:ascii="Avenir Next" w:cs="Avenir Next" w:eastAsia="Avenir Next" w:hAnsi="Avenir Next"/>
                       <w:b w:val="false"/>
                       <w:bCs w:val="false"/>
                       <w:i w:val="false"/>
@@ -4926,11 +5006,11 @@
                 </w:tcPr>
                 <w:p>
                   <w:pPr>
-                    <w:spacing w:after="0"/>
-                  </w:pPr>
-                  <w:r>
-                    <w:rPr>
-                      <w:rFonts w:ascii="Calibri" w:cs="Calibri" w:eastAsia="Times New Roman" w:hAnsi="Calibri"/>
+                    <w:spacing w:after="0" w:line="204" w:lineRule="auto"/>
+                  </w:pPr>
+                  <w:r>
+                    <w:rPr>
+                      <w:rFonts w:ascii="Avenir Next" w:cs="Avenir Next" w:eastAsia="Avenir Next" w:hAnsi="Avenir Next"/>
                       <w:b w:val="false"/>
                       <w:bCs w:val="false"/>
                       <w:i w:val="false"/>
@@ -4955,11 +5035,11 @@
                 </w:tcPr>
                 <w:p>
                   <w:pPr>
-                    <w:spacing w:after="0"/>
-                  </w:pPr>
-                  <w:r>
-                    <w:rPr>
-                      <w:rFonts w:ascii="Calibri" w:cs="Calibri" w:eastAsia="Times New Roman" w:hAnsi="Calibri"/>
+                    <w:spacing w:after="0" w:line="204" w:lineRule="auto"/>
+                  </w:pPr>
+                  <w:r>
+                    <w:rPr>
+                      <w:rFonts w:ascii="Avenir Next" w:cs="Avenir Next" w:eastAsia="Avenir Next" w:hAnsi="Avenir Next"/>
                       <w:b w:val="false"/>
                       <w:bCs w:val="false"/>
                       <w:i w:val="false"/>
@@ -4986,12 +5066,12 @@
                 </w:tcPr>
                 <w:p>
                   <w:pPr>
-                    <w:spacing w:after="0"/>
+                    <w:spacing w:after="0" w:line="204" w:lineRule="auto"/>
                     <w:jc w:val="right"/>
                   </w:pPr>
                   <w:r>
                     <w:rPr>
-                      <w:rFonts w:ascii="Calibri" w:cs="Calibri" w:eastAsia="Times New Roman" w:hAnsi="Calibri"/>
+                      <w:rFonts w:ascii="Avenir Next Condensed" w:cs="Avenir Next Condensed" w:eastAsia="Avenir Next Condensed" w:hAnsi="Avenir Next Condensed"/>
                       <w:b/>
                       <w:bCs/>
                       <w:i w:val="false"/>
@@ -5016,11 +5096,11 @@
                 </w:tcPr>
                 <w:p>
                   <w:pPr>
-                    <w:spacing w:after="0"/>
-                  </w:pPr>
-                  <w:r>
-                    <w:rPr>
-                      <w:rFonts w:ascii="Calibri" w:cs="Calibri" w:eastAsia="Times New Roman" w:hAnsi="Calibri"/>
+                    <w:spacing w:after="0" w:line="204" w:lineRule="auto"/>
+                  </w:pPr>
+                  <w:r>
+                    <w:rPr>
+                      <w:rFonts w:ascii="Avenir Next" w:cs="Avenir Next" w:eastAsia="Avenir Next" w:hAnsi="Avenir Next"/>
                       <w:b w:val="false"/>
                       <w:bCs w:val="false"/>
                       <w:i w:val="false"/>
@@ -5045,11 +5125,11 @@
                 </w:tcPr>
                 <w:p>
                   <w:pPr>
-                    <w:spacing w:after="0"/>
-                  </w:pPr>
-                  <w:r>
-                    <w:rPr>
-                      <w:rFonts w:ascii="Calibri" w:cs="Calibri" w:eastAsia="Times New Roman" w:hAnsi="Calibri"/>
+                    <w:spacing w:after="0" w:line="204" w:lineRule="auto"/>
+                  </w:pPr>
+                  <w:r>
+                    <w:rPr>
+                      <w:rFonts w:ascii="Avenir Next" w:cs="Avenir Next" w:eastAsia="Avenir Next" w:hAnsi="Avenir Next"/>
                       <w:b w:val="false"/>
                       <w:bCs w:val="false"/>
                       <w:i w:val="false"/>
@@ -5074,11 +5154,11 @@
                 </w:tcPr>
                 <w:p>
                   <w:pPr>
-                    <w:spacing w:after="0"/>
-                  </w:pPr>
-                  <w:r>
-                    <w:rPr>
-                      <w:rFonts w:ascii="Calibri" w:cs="Calibri" w:eastAsia="Times New Roman" w:hAnsi="Calibri"/>
+                    <w:spacing w:after="0" w:line="204" w:lineRule="auto"/>
+                  </w:pPr>
+                  <w:r>
+                    <w:rPr>
+                      <w:rFonts w:ascii="Avenir Next" w:cs="Avenir Next" w:eastAsia="Avenir Next" w:hAnsi="Avenir Next"/>
                       <w:b w:val="false"/>
                       <w:bCs w:val="false"/>
                       <w:i w:val="false"/>
@@ -5105,12 +5185,12 @@
                 </w:tcPr>
                 <w:p>
                   <w:pPr>
-                    <w:spacing w:after="0"/>
+                    <w:spacing w:after="0" w:line="204" w:lineRule="auto"/>
                     <w:jc w:val="right"/>
                   </w:pPr>
                   <w:r>
                     <w:rPr>
-                      <w:rFonts w:ascii="Calibri" w:cs="Calibri" w:eastAsia="Times New Roman" w:hAnsi="Calibri"/>
+                      <w:rFonts w:ascii="Avenir Next Condensed" w:cs="Avenir Next Condensed" w:eastAsia="Avenir Next Condensed" w:hAnsi="Avenir Next Condensed"/>
                       <w:b/>
                       <w:bCs/>
                       <w:i w:val="false"/>
@@ -5135,67 +5215,67 @@
                 </w:tcPr>
                 <w:p>
                   <w:pPr>
-                    <w:spacing w:after="0"/>
-                  </w:pPr>
-                  <w:r>
-                    <w:rPr>
-                      <w:rFonts w:ascii="Calibri" w:cs="Calibri" w:eastAsia="Times New Roman" w:hAnsi="Calibri"/>
-                      <w:b w:val="false"/>
-                      <w:bCs w:val="false"/>
-                      <w:i w:val="false"/>
-                      <w:iCs w:val="false"/>
-                      <w:sz w:val="20"/>
-                      <w:szCs w:val="20"/>
-                    </w:rPr>
-                  </w:r>
-                </w:p>
-              </w:tc>
-              <w:tc>
-                <w:tcPr>
-                  <w:tcW w:type="dxa" w:w="1850"/>
-                  <w:tcMar>
-                    <w:top w:type="dxa" w:w="40"/>
-                    <w:left w:type="dxa" w:w="80"/>
-                    <w:bottom w:type="dxa" w:w="40"/>
-                    <w:right w:type="dxa" w:w="80"/>
-                  </w:tcMar>
-                  <w:vAlign w:val="top"/>
-                </w:tcPr>
-                <w:p>
-                  <w:pPr>
-                    <w:spacing w:after="0"/>
-                  </w:pPr>
-                  <w:r>
-                    <w:rPr>
-                      <w:rFonts w:ascii="Calibri" w:cs="Calibri" w:eastAsia="Times New Roman" w:hAnsi="Calibri"/>
-                      <w:b w:val="false"/>
-                      <w:bCs w:val="false"/>
-                      <w:i w:val="false"/>
-                      <w:iCs w:val="false"/>
-                      <w:sz w:val="20"/>
-                      <w:szCs w:val="20"/>
-                    </w:rPr>
-                  </w:r>
-                </w:p>
-              </w:tc>
-              <w:tc>
-                <w:tcPr>
-                  <w:tcW w:type="dxa" w:w="1850"/>
-                  <w:tcMar>
-                    <w:top w:type="dxa" w:w="40"/>
-                    <w:left w:type="dxa" w:w="80"/>
-                    <w:bottom w:type="dxa" w:w="40"/>
-                    <w:right w:type="dxa" w:w="80"/>
-                  </w:tcMar>
-                  <w:vAlign w:val="top"/>
-                </w:tcPr>
-                <w:p>
-                  <w:pPr>
-                    <w:spacing w:after="0"/>
-                  </w:pPr>
-                  <w:r>
-                    <w:rPr>
-                      <w:rFonts w:ascii="Calibri" w:cs="Calibri" w:eastAsia="Times New Roman" w:hAnsi="Calibri"/>
+                    <w:spacing w:after="0" w:line="204" w:lineRule="auto"/>
+                  </w:pPr>
+                  <w:r>
+                    <w:rPr>
+                      <w:rFonts w:ascii="Avenir Next" w:cs="Avenir Next" w:eastAsia="Avenir Next" w:hAnsi="Avenir Next"/>
+                      <w:b w:val="false"/>
+                      <w:bCs w:val="false"/>
+                      <w:i w:val="false"/>
+                      <w:iCs w:val="false"/>
+                      <w:sz w:val="20"/>
+                      <w:szCs w:val="20"/>
+                    </w:rPr>
+                  </w:r>
+                </w:p>
+              </w:tc>
+              <w:tc>
+                <w:tcPr>
+                  <w:tcW w:type="dxa" w:w="1850"/>
+                  <w:tcMar>
+                    <w:top w:type="dxa" w:w="40"/>
+                    <w:left w:type="dxa" w:w="80"/>
+                    <w:bottom w:type="dxa" w:w="40"/>
+                    <w:right w:type="dxa" w:w="80"/>
+                  </w:tcMar>
+                  <w:vAlign w:val="top"/>
+                </w:tcPr>
+                <w:p>
+                  <w:pPr>
+                    <w:spacing w:after="0" w:line="204" w:lineRule="auto"/>
+                  </w:pPr>
+                  <w:r>
+                    <w:rPr>
+                      <w:rFonts w:ascii="Avenir Next" w:cs="Avenir Next" w:eastAsia="Avenir Next" w:hAnsi="Avenir Next"/>
+                      <w:b w:val="false"/>
+                      <w:bCs w:val="false"/>
+                      <w:i w:val="false"/>
+                      <w:iCs w:val="false"/>
+                      <w:sz w:val="20"/>
+                      <w:szCs w:val="20"/>
+                    </w:rPr>
+                  </w:r>
+                </w:p>
+              </w:tc>
+              <w:tc>
+                <w:tcPr>
+                  <w:tcW w:type="dxa" w:w="1850"/>
+                  <w:tcMar>
+                    <w:top w:type="dxa" w:w="40"/>
+                    <w:left w:type="dxa" w:w="80"/>
+                    <w:bottom w:type="dxa" w:w="40"/>
+                    <w:right w:type="dxa" w:w="80"/>
+                  </w:tcMar>
+                  <w:vAlign w:val="top"/>
+                </w:tcPr>
+                <w:p>
+                  <w:pPr>
+                    <w:spacing w:after="0" w:line="204" w:lineRule="auto"/>
+                  </w:pPr>
+                  <w:r>
+                    <w:rPr>
+                      <w:rFonts w:ascii="Avenir Next" w:cs="Avenir Next" w:eastAsia="Avenir Next" w:hAnsi="Avenir Next"/>
                       <w:b w:val="false"/>
                       <w:bCs w:val="false"/>
                       <w:i w:val="false"/>
@@ -5208,7 +5288,11 @@
               </w:tc>
             </w:tr>
           </w:tbl>
-          <w:p/>
+          <w:p>
+            <w:pPr>
+              <w:spacing w:line="204" w:lineRule="auto"/>
+            </w:pPr>
+          </w:p>
         </w:tc>
       </w:tr>
     </w:tbl>
@@ -5216,7 +5300,7 @@
       <w:headerReference w:type="default" r:id="rId8"/>
       <w:footerReference w:type="default" r:id="rId9"/>
       <w:pgSz w:w="12240" w:h="15840" w:orient="portrait"/>
-      <w:pgMar w:top="576" w:right="720" w:bottom="576" w:left="720" w:header="708" w:footer="708" w:gutter="0"/>
+      <w:pgMar w:top="1080" w:right="720" w:bottom="576" w:left="720" w:header="432" w:footer="708" w:gutter="0"/>
       <w:pgNumType/>
       <w:docGrid w:linePitch="360"/>
     </w:sectPr>
@@ -5317,7 +5401,47 @@
   <w:p>
     <w:pPr>
       <w:pStyle w:val="Header"/>
+      <w:tabs>
+        <w:tab w:pos="10800" w:val="right"/>
+      </w:tabs>
     </w:pPr>
+    <w:r>
+      <w:drawing>
+        <wp:inline xmlns:a="http://schemas.openxmlformats.org/drawingml/2006/main" xmlns:pic="http://schemas.openxmlformats.org/drawingml/2006/picture">
+          <wp:extent cx="809503" cy="274320"/>
+          <wp:docPr id="1" name="Picture 1"/>
+          <wp:cNvGraphicFramePr>
+            <a:graphicFrameLocks noChangeAspect="1"/>
+          </wp:cNvGraphicFramePr>
+          <a:graphic>
+            <a:graphicData uri="http://schemas.openxmlformats.org/drawingml/2006/picture">
+              <pic:pic>
+                <pic:nvPicPr>
+                  <pic:cNvPr id="0" name="3cdc-primary.png"/>
+                  <pic:cNvPicPr/>
+                </pic:nvPicPr>
+                <pic:blipFill>
+                  <a:blip r:embed="rId1"/>
+                  <a:stretch>
+                    <a:fillRect/>
+                  </a:stretch>
+                </pic:blipFill>
+                <pic:spPr>
+                  <a:xfrm>
+                    <a:off x="0" y="0"/>
+                    <a:ext cx="809503" cy="274320"/>
+                  </a:xfrm>
+                  <a:prstGeom prst="rect"/>
+                </pic:spPr>
+              </pic:pic>
+            </a:graphicData>
+          </a:graphic>
+        </wp:inline>
+      </w:drawing>
+    </w:r>
+    <w:r>
+      <w:tab/>
+    </w:r>
   </w:p>
 </w:hdr>
 </file>
@@ -5422,7 +5546,8 @@
   <w:docDefaults>
     <w:rPrDefault>
       <w:rPr>
-        <w:rFonts w:ascii="Calibri" w:hAnsi="Calibri" w:cs="Calibri"/>
+        <w:rFonts w:ascii="Avenir Next" w:hAnsi="Avenir Next" w:cs="Avenir Next" w:eastAsia="Avenir Next"/>
+        <w:color w:val="595A5C"/>
       </w:rPr>
     </w:rPrDefault>
     <w:pPrDefault/>

</xml_diff>